<commit_message>
Finalizando termo de Sessão
</commit_message>
<xml_diff>
--- a/doc_templates/termo_cessao.docx
+++ b/doc_templates/termo_cessao.docx
@@ -1,6 +1,6 @@
 
 <file path=word/document.xml><?xml version="1.0" encoding="utf-8"?>
-<w:document xmlns:wpc="http://schemas.microsoft.com/office/word/2010/wordprocessingCanvas" xmlns:cx="http://schemas.microsoft.com/office/drawing/2014/chartex" xmlns:cx1="http://schemas.microsoft.com/office/drawing/2015/9/8/chartex" xmlns:cx2="http://schemas.microsoft.com/office/drawing/2015/10/21/chartex" xmlns:cx3="http://schemas.microsoft.com/office/drawing/2016/5/9/chartex" xmlns:cx4="http://schemas.microsoft.com/office/drawing/2016/5/10/chartex" xmlns:cx5="http://schemas.microsoft.com/office/drawing/2016/5/11/chartex" xmlns:cx6="http://schemas.microsoft.com/office/drawing/2016/5/12/chartex" xmlns:cx7="http://schemas.microsoft.com/office/drawing/2016/5/13/chartex" xmlns:cx8="http://schemas.microsoft.com/office/drawing/2016/5/14/chartex" xmlns:mc="http://schemas.openxmlformats.org/markup-compatibility/2006" xmlns:aink="http://schemas.microsoft.com/office/drawing/2016/ink" xmlns:am3d="http://schemas.microsoft.com/office/drawing/2017/model3d" xmlns:o="urn:schemas-microsoft-com:office:office" xmlns:r="http://schemas.openxmlformats.org/officeDocument/2006/relationships" xmlns:m="http://schemas.openxmlformats.org/officeDocument/2006/math" xmlns:v="urn:schemas-microsoft-com:vml" xmlns:wp14="http://schemas.microsoft.com/office/word/2010/wordprocessingDrawing" xmlns:wp="http://schemas.openxmlformats.org/drawingml/2006/wordprocessingDrawing" xmlns:w10="urn:schemas-microsoft-com:office:word" xmlns:w="http://schemas.openxmlformats.org/wordprocessingml/2006/main" xmlns:w14="http://schemas.microsoft.com/office/word/2010/wordml" xmlns:w15="http://schemas.microsoft.com/office/word/2012/wordml" xmlns:w16cex="http://schemas.microsoft.com/office/word/2018/wordml/cex" xmlns:w16cid="http://schemas.microsoft.com/office/word/2016/wordml/cid" xmlns:w16="http://schemas.microsoft.com/office/word/2018/wordml" xmlns:w16sdtdh="http://schemas.microsoft.com/office/word/2020/wordml/sdtdatahash" xmlns:w16se="http://schemas.microsoft.com/office/word/2015/wordml/symex" xmlns:wpg="http://schemas.microsoft.com/office/word/2010/wordprocessingGroup" xmlns:wpi="http://schemas.microsoft.com/office/word/2010/wordprocessingInk" xmlns:wne="http://schemas.microsoft.com/office/word/2006/wordml" xmlns:wps="http://schemas.microsoft.com/office/word/2010/wordprocessingShape" mc:Ignorable="w14 w15 w16se w16cid w16 w16cex w16sdtdh wp14">
+<w:document xmlns:wpc="http://schemas.microsoft.com/office/word/2010/wordprocessingCanvas" xmlns:cx="http://schemas.microsoft.com/office/drawing/2014/chartex" xmlns:cx1="http://schemas.microsoft.com/office/drawing/2015/9/8/chartex" xmlns:cx2="http://schemas.microsoft.com/office/drawing/2015/10/21/chartex" xmlns:cx3="http://schemas.microsoft.com/office/drawing/2016/5/9/chartex" xmlns:cx4="http://schemas.microsoft.com/office/drawing/2016/5/10/chartex" xmlns:cx5="http://schemas.microsoft.com/office/drawing/2016/5/11/chartex" xmlns:cx6="http://schemas.microsoft.com/office/drawing/2016/5/12/chartex" xmlns:cx7="http://schemas.microsoft.com/office/drawing/2016/5/13/chartex" xmlns:cx8="http://schemas.microsoft.com/office/drawing/2016/5/14/chartex" xmlns:mc="http://schemas.openxmlformats.org/markup-compatibility/2006" xmlns:aink="http://schemas.microsoft.com/office/drawing/2016/ink" xmlns:am3d="http://schemas.microsoft.com/office/drawing/2017/model3d" xmlns:o="urn:schemas-microsoft-com:office:office" xmlns:oel="http://schemas.microsoft.com/office/2019/extlst" xmlns:r="http://schemas.openxmlformats.org/officeDocument/2006/relationships" xmlns:m="http://schemas.openxmlformats.org/officeDocument/2006/math" xmlns:v="urn:schemas-microsoft-com:vml" xmlns:wp14="http://schemas.microsoft.com/office/word/2010/wordprocessingDrawing" xmlns:wp="http://schemas.openxmlformats.org/drawingml/2006/wordprocessingDrawing" xmlns:w10="urn:schemas-microsoft-com:office:word" xmlns:w="http://schemas.openxmlformats.org/wordprocessingml/2006/main" xmlns:w14="http://schemas.microsoft.com/office/word/2010/wordml" xmlns:w15="http://schemas.microsoft.com/office/word/2012/wordml" xmlns:w16cex="http://schemas.microsoft.com/office/word/2018/wordml/cex" xmlns:w16cid="http://schemas.microsoft.com/office/word/2016/wordml/cid" xmlns:w16="http://schemas.microsoft.com/office/word/2018/wordml" xmlns:w16du="http://schemas.microsoft.com/office/word/2023/wordml/word16du" xmlns:w16sdtdh="http://schemas.microsoft.com/office/word/2020/wordml/sdtdatahash" xmlns:w16sdtfl="http://schemas.microsoft.com/office/word/2024/wordml/sdtformatlock" xmlns:w16se="http://schemas.microsoft.com/office/word/2015/wordml/symex" xmlns:wpg="http://schemas.microsoft.com/office/word/2010/wordprocessingGroup" xmlns:wpi="http://schemas.microsoft.com/office/word/2010/wordprocessingInk" xmlns:wne="http://schemas.microsoft.com/office/word/2006/wordml" xmlns:wps="http://schemas.microsoft.com/office/word/2010/wordprocessingShape" mc:Ignorable="w14 w15 w16se w16cid w16 w16cex w16sdtdh w16sdtfl w16du wp14">
   <w:body>
     <w:p>
       <w:pPr>
@@ -650,15 +650,767 @@
         <w:t>:</w:t>
       </w:r>
     </w:p>
+    <w:tbl>
+      <w:tblPr>
+        <w:tblStyle w:val="Tabelacomgrade"/>
+        <w:tblW w:w="0" w:type="auto"/>
+        <w:tblLook w:val="04A0" w:firstRow="1" w:lastRow="0" w:firstColumn="1" w:lastColumn="0" w:noHBand="0" w:noVBand="1"/>
+      </w:tblPr>
+      <w:tblGrid>
+        <w:gridCol w:w="2453"/>
+        <w:gridCol w:w="2112"/>
+        <w:gridCol w:w="1642"/>
+        <w:gridCol w:w="1404"/>
+        <w:gridCol w:w="1786"/>
+      </w:tblGrid>
+      <w:tr>
+        <w:trPr>
+          <w:trHeight w:val="20"/>
+        </w:trPr>
+        <w:tc>
+          <w:tcPr>
+            <w:tcW w:w="2512" w:type="dxa"/>
+            <w:shd w:val="clear" w:color="auto" w:fill="E7E6E6" w:themeFill="background2"/>
+            <w:vAlign w:val="center"/>
+          </w:tcPr>
+          <w:p>
+            <w:pPr>
+              <w:tabs>
+                <w:tab w:val="left" w:pos="567"/>
+              </w:tabs>
+              <w:jc w:val="center"/>
+              <w:rPr>
+                <w:rFonts w:asciiTheme="minorHAnsi" w:hAnsiTheme="minorHAnsi" w:cstheme="minorHAnsi"/>
+                <w:b/>
+                <w:bCs/>
+                <w:sz w:val="22"/>
+                <w:szCs w:val="22"/>
+                <w:lang w:val="pt-BR"/>
+              </w:rPr>
+            </w:pPr>
+            <w:r>
+              <w:rPr>
+                <w:rFonts w:asciiTheme="minorHAnsi" w:hAnsiTheme="minorHAnsi" w:cstheme="minorHAnsi"/>
+                <w:b/>
+                <w:bCs/>
+                <w:sz w:val="22"/>
+                <w:szCs w:val="22"/>
+                <w:lang w:val="pt-BR"/>
+              </w:rPr>
+              <w:t>Razão Social (Sacado)</w:t>
+            </w:r>
+          </w:p>
+        </w:tc>
+        <w:tc>
+          <w:tcPr>
+            <w:tcW w:w="2161" w:type="dxa"/>
+            <w:shd w:val="clear" w:color="auto" w:fill="E7E6E6" w:themeFill="background2"/>
+            <w:vAlign w:val="center"/>
+          </w:tcPr>
+          <w:p>
+            <w:pPr>
+              <w:tabs>
+                <w:tab w:val="left" w:pos="567"/>
+              </w:tabs>
+              <w:jc w:val="center"/>
+              <w:rPr>
+                <w:rFonts w:asciiTheme="minorHAnsi" w:hAnsiTheme="minorHAnsi" w:cstheme="minorHAnsi"/>
+                <w:b/>
+                <w:bCs/>
+                <w:sz w:val="22"/>
+                <w:szCs w:val="22"/>
+                <w:lang w:val="pt-BR"/>
+              </w:rPr>
+            </w:pPr>
+            <w:r>
+              <w:rPr>
+                <w:rFonts w:asciiTheme="minorHAnsi" w:hAnsiTheme="minorHAnsi" w:cstheme="minorHAnsi"/>
+                <w:b/>
+                <w:bCs/>
+                <w:sz w:val="22"/>
+                <w:szCs w:val="22"/>
+                <w:lang w:val="pt-BR"/>
+              </w:rPr>
+              <w:t>CNPJ (Sacado)</w:t>
+            </w:r>
+          </w:p>
+        </w:tc>
+        <w:tc>
+          <w:tcPr>
+            <w:tcW w:w="1701" w:type="dxa"/>
+            <w:shd w:val="clear" w:color="auto" w:fill="E7E6E6" w:themeFill="background2"/>
+            <w:vAlign w:val="center"/>
+          </w:tcPr>
+          <w:p>
+            <w:pPr>
+              <w:tabs>
+                <w:tab w:val="left" w:pos="567"/>
+              </w:tabs>
+              <w:jc w:val="center"/>
+              <w:rPr>
+                <w:rFonts w:asciiTheme="minorHAnsi" w:hAnsiTheme="minorHAnsi" w:cstheme="minorHAnsi"/>
+                <w:b/>
+                <w:bCs/>
+                <w:sz w:val="22"/>
+                <w:szCs w:val="22"/>
+                <w:lang w:val="pt-BR"/>
+              </w:rPr>
+            </w:pPr>
+            <w:r>
+              <w:rPr>
+                <w:rFonts w:asciiTheme="minorHAnsi" w:hAnsiTheme="minorHAnsi" w:cstheme="minorHAnsi"/>
+                <w:b/>
+                <w:bCs/>
+                <w:sz w:val="22"/>
+                <w:szCs w:val="22"/>
+                <w:lang w:val="pt-BR"/>
+              </w:rPr>
+              <w:t>Valor Nota (R$)</w:t>
+            </w:r>
+          </w:p>
+        </w:tc>
+        <w:tc>
+          <w:tcPr>
+            <w:tcW w:w="1175" w:type="dxa"/>
+            <w:shd w:val="clear" w:color="auto" w:fill="E7E6E6" w:themeFill="background2"/>
+            <w:vAlign w:val="center"/>
+          </w:tcPr>
+          <w:p>
+            <w:pPr>
+              <w:tabs>
+                <w:tab w:val="left" w:pos="567"/>
+              </w:tabs>
+              <w:jc w:val="center"/>
+              <w:rPr>
+                <w:rFonts w:asciiTheme="minorHAnsi" w:hAnsiTheme="minorHAnsi" w:cstheme="minorHAnsi"/>
+                <w:b/>
+                <w:bCs/>
+                <w:sz w:val="22"/>
+                <w:szCs w:val="22"/>
+                <w:lang w:val="pt-BR"/>
+              </w:rPr>
+            </w:pPr>
+            <w:r>
+              <w:rPr>
+                <w:rFonts w:asciiTheme="minorHAnsi" w:hAnsiTheme="minorHAnsi" w:cstheme="minorHAnsi"/>
+                <w:b/>
+                <w:bCs/>
+                <w:sz w:val="22"/>
+                <w:szCs w:val="22"/>
+                <w:lang w:val="pt-BR"/>
+              </w:rPr>
+              <w:t>Vencimento</w:t>
+            </w:r>
+          </w:p>
+        </w:tc>
+        <w:tc>
+          <w:tcPr>
+            <w:tcW w:w="1848" w:type="dxa"/>
+            <w:shd w:val="clear" w:color="auto" w:fill="E7E6E6" w:themeFill="background2"/>
+            <w:vAlign w:val="center"/>
+          </w:tcPr>
+          <w:p>
+            <w:pPr>
+              <w:tabs>
+                <w:tab w:val="left" w:pos="567"/>
+              </w:tabs>
+              <w:jc w:val="center"/>
+              <w:rPr>
+                <w:rFonts w:asciiTheme="minorHAnsi" w:hAnsiTheme="minorHAnsi" w:cstheme="minorHAnsi"/>
+                <w:b/>
+                <w:bCs/>
+                <w:sz w:val="22"/>
+                <w:szCs w:val="22"/>
+                <w:lang w:val="pt-BR"/>
+              </w:rPr>
+            </w:pPr>
+            <w:r>
+              <w:rPr>
+                <w:rFonts w:asciiTheme="minorHAnsi" w:hAnsiTheme="minorHAnsi" w:cstheme="minorHAnsi"/>
+                <w:b/>
+                <w:bCs/>
+                <w:sz w:val="22"/>
+                <w:szCs w:val="22"/>
+                <w:lang w:val="pt-BR"/>
+              </w:rPr>
+              <w:t>Título de Crédito</w:t>
+            </w:r>
+          </w:p>
+        </w:tc>
+      </w:tr>
+      <w:tr>
+        <w:trPr>
+          <w:trHeight w:val="20"/>
+        </w:trPr>
+        <w:tc>
+          <w:tcPr>
+            <w:tcW w:w="2512" w:type="dxa"/>
+            <w:vAlign w:val="center"/>
+          </w:tcPr>
+          <w:p>
+            <w:pPr>
+              <w:tabs>
+                <w:tab w:val="left" w:pos="567"/>
+              </w:tabs>
+              <w:jc w:val="center"/>
+              <w:rPr>
+                <w:rFonts w:asciiTheme="minorHAnsi" w:hAnsiTheme="minorHAnsi" w:cstheme="minorHAnsi"/>
+                <w:sz w:val="22"/>
+                <w:szCs w:val="22"/>
+              </w:rPr>
+            </w:pPr>
+            <w:r>
+              <w:rPr>
+                <w:rFonts w:asciiTheme="minorHAnsi" w:hAnsiTheme="minorHAnsi" w:cstheme="minorHAnsi"/>
+                <w:sz w:val="22"/>
+                <w:szCs w:val="22"/>
+              </w:rPr>
+              <w:t xml:space="preserve">{%tr for t in </w:t>
+            </w:r>
+            <w:proofErr w:type="spellStart"/>
+            <w:r>
+              <w:rPr>
+                <w:rFonts w:asciiTheme="minorHAnsi" w:hAnsiTheme="minorHAnsi" w:cstheme="minorHAnsi"/>
+                <w:sz w:val="22"/>
+                <w:szCs w:val="22"/>
+              </w:rPr>
+              <w:t>titulos</w:t>
+            </w:r>
+            <w:proofErr w:type="spellEnd"/>
+            <w:r>
+              <w:rPr>
+                <w:rFonts w:asciiTheme="minorHAnsi" w:hAnsiTheme="minorHAnsi" w:cstheme="minorHAnsi"/>
+                <w:sz w:val="22"/>
+                <w:szCs w:val="22"/>
+              </w:rPr>
+              <w:t xml:space="preserve"> %}</w:t>
+            </w:r>
+          </w:p>
+        </w:tc>
+        <w:tc>
+          <w:tcPr>
+            <w:tcW w:w="2161" w:type="dxa"/>
+            <w:vAlign w:val="center"/>
+          </w:tcPr>
+          <w:p>
+            <w:pPr>
+              <w:tabs>
+                <w:tab w:val="left" w:pos="567"/>
+              </w:tabs>
+              <w:jc w:val="center"/>
+              <w:rPr>
+                <w:rFonts w:asciiTheme="minorHAnsi" w:hAnsiTheme="minorHAnsi" w:cstheme="minorHAnsi"/>
+                <w:sz w:val="22"/>
+                <w:szCs w:val="22"/>
+              </w:rPr>
+            </w:pPr>
+          </w:p>
+        </w:tc>
+        <w:tc>
+          <w:tcPr>
+            <w:tcW w:w="1701" w:type="dxa"/>
+            <w:vAlign w:val="center"/>
+          </w:tcPr>
+          <w:p>
+            <w:pPr>
+              <w:tabs>
+                <w:tab w:val="left" w:pos="567"/>
+              </w:tabs>
+              <w:jc w:val="center"/>
+              <w:rPr>
+                <w:rFonts w:asciiTheme="minorHAnsi" w:hAnsiTheme="minorHAnsi" w:cstheme="minorHAnsi"/>
+                <w:sz w:val="22"/>
+                <w:szCs w:val="22"/>
+              </w:rPr>
+            </w:pPr>
+          </w:p>
+        </w:tc>
+        <w:tc>
+          <w:tcPr>
+            <w:tcW w:w="1175" w:type="dxa"/>
+            <w:vAlign w:val="center"/>
+          </w:tcPr>
+          <w:p>
+            <w:pPr>
+              <w:tabs>
+                <w:tab w:val="left" w:pos="567"/>
+              </w:tabs>
+              <w:jc w:val="center"/>
+              <w:rPr>
+                <w:rFonts w:asciiTheme="minorHAnsi" w:hAnsiTheme="minorHAnsi" w:cstheme="minorHAnsi"/>
+                <w:sz w:val="22"/>
+                <w:szCs w:val="22"/>
+              </w:rPr>
+            </w:pPr>
+          </w:p>
+        </w:tc>
+        <w:tc>
+          <w:tcPr>
+            <w:tcW w:w="1848" w:type="dxa"/>
+            <w:vAlign w:val="center"/>
+          </w:tcPr>
+          <w:p>
+            <w:pPr>
+              <w:tabs>
+                <w:tab w:val="left" w:pos="567"/>
+              </w:tabs>
+              <w:jc w:val="center"/>
+              <w:rPr>
+                <w:rFonts w:asciiTheme="minorHAnsi" w:hAnsiTheme="minorHAnsi" w:cstheme="minorHAnsi"/>
+                <w:sz w:val="22"/>
+                <w:szCs w:val="22"/>
+              </w:rPr>
+            </w:pPr>
+          </w:p>
+        </w:tc>
+      </w:tr>
+      <w:tr>
+        <w:trPr>
+          <w:trHeight w:val="113"/>
+        </w:trPr>
+        <w:tc>
+          <w:tcPr>
+            <w:tcW w:w="2512" w:type="dxa"/>
+            <w:vAlign w:val="center"/>
+          </w:tcPr>
+          <w:p>
+            <w:pPr>
+              <w:tabs>
+                <w:tab w:val="left" w:pos="567"/>
+              </w:tabs>
+              <w:jc w:val="center"/>
+              <w:rPr>
+                <w:rFonts w:asciiTheme="minorHAnsi" w:hAnsiTheme="minorHAnsi" w:cstheme="minorHAnsi"/>
+                <w:sz w:val="22"/>
+                <w:szCs w:val="22"/>
+                <w:lang w:val="pt-BR"/>
+              </w:rPr>
+            </w:pPr>
+            <w:proofErr w:type="gramStart"/>
+            <w:r>
+              <w:rPr>
+                <w:rFonts w:asciiTheme="minorHAnsi" w:hAnsiTheme="minorHAnsi" w:cstheme="minorHAnsi"/>
+                <w:sz w:val="22"/>
+                <w:szCs w:val="22"/>
+              </w:rPr>
+              <w:t>{</w:t>
+            </w:r>
+            <w:r>
+              <w:rPr>
+                <w:rFonts w:asciiTheme="minorHAnsi" w:hAnsiTheme="minorHAnsi" w:cstheme="minorHAnsi"/>
+                <w:sz w:val="22"/>
+                <w:szCs w:val="22"/>
+              </w:rPr>
+              <w:t xml:space="preserve">{ </w:t>
+            </w:r>
+            <w:proofErr w:type="spellStart"/>
+            <w:r>
+              <w:rPr>
+                <w:rFonts w:asciiTheme="minorHAnsi" w:hAnsiTheme="minorHAnsi" w:cstheme="minorHAnsi"/>
+                <w:sz w:val="22"/>
+                <w:szCs w:val="22"/>
+              </w:rPr>
+              <w:t>t</w:t>
+            </w:r>
+            <w:proofErr w:type="gramEnd"/>
+            <w:r>
+              <w:rPr>
+                <w:rFonts w:asciiTheme="minorHAnsi" w:hAnsiTheme="minorHAnsi" w:cstheme="minorHAnsi"/>
+                <w:sz w:val="22"/>
+                <w:szCs w:val="22"/>
+              </w:rPr>
+              <w:t>.sacado_nome</w:t>
+            </w:r>
+            <w:proofErr w:type="spellEnd"/>
+            <w:r>
+              <w:rPr>
+                <w:rFonts w:asciiTheme="minorHAnsi" w:hAnsiTheme="minorHAnsi" w:cstheme="minorHAnsi"/>
+                <w:sz w:val="22"/>
+                <w:szCs w:val="22"/>
+              </w:rPr>
+              <w:t xml:space="preserve"> }}</w:t>
+            </w:r>
+          </w:p>
+        </w:tc>
+        <w:tc>
+          <w:tcPr>
+            <w:tcW w:w="2161" w:type="dxa"/>
+            <w:vAlign w:val="center"/>
+          </w:tcPr>
+          <w:p>
+            <w:pPr>
+              <w:tabs>
+                <w:tab w:val="left" w:pos="567"/>
+              </w:tabs>
+              <w:jc w:val="center"/>
+              <w:rPr>
+                <w:rFonts w:asciiTheme="minorHAnsi" w:hAnsiTheme="minorHAnsi" w:cstheme="minorHAnsi"/>
+                <w:sz w:val="22"/>
+                <w:szCs w:val="22"/>
+                <w:lang w:val="pt-BR"/>
+              </w:rPr>
+            </w:pPr>
+            <w:proofErr w:type="gramStart"/>
+            <w:r>
+              <w:rPr>
+                <w:rFonts w:asciiTheme="minorHAnsi" w:hAnsiTheme="minorHAnsi" w:cstheme="minorHAnsi"/>
+                <w:sz w:val="22"/>
+                <w:szCs w:val="22"/>
+                <w:lang w:val="pt-BR"/>
+              </w:rPr>
+              <w:t xml:space="preserve">{{ </w:t>
+            </w:r>
+            <w:proofErr w:type="spellStart"/>
+            <w:r>
+              <w:rPr>
+                <w:rFonts w:asciiTheme="minorHAnsi" w:hAnsiTheme="minorHAnsi" w:cstheme="minorHAnsi"/>
+                <w:sz w:val="22"/>
+                <w:szCs w:val="22"/>
+                <w:lang w:val="pt-BR"/>
+              </w:rPr>
+              <w:t>t</w:t>
+            </w:r>
+            <w:proofErr w:type="gramEnd"/>
+            <w:r>
+              <w:rPr>
+                <w:rFonts w:asciiTheme="minorHAnsi" w:hAnsiTheme="minorHAnsi" w:cstheme="minorHAnsi"/>
+                <w:sz w:val="22"/>
+                <w:szCs w:val="22"/>
+                <w:lang w:val="pt-BR"/>
+              </w:rPr>
+              <w:t>.sacado_doc</w:t>
+            </w:r>
+            <w:proofErr w:type="spellEnd"/>
+            <w:r>
+              <w:rPr>
+                <w:rFonts w:asciiTheme="minorHAnsi" w:hAnsiTheme="minorHAnsi" w:cstheme="minorHAnsi"/>
+                <w:sz w:val="22"/>
+                <w:szCs w:val="22"/>
+                <w:lang w:val="pt-BR"/>
+              </w:rPr>
+              <w:t xml:space="preserve"> }}</w:t>
+            </w:r>
+          </w:p>
+        </w:tc>
+        <w:tc>
+          <w:tcPr>
+            <w:tcW w:w="1701" w:type="dxa"/>
+            <w:vAlign w:val="center"/>
+          </w:tcPr>
+          <w:p>
+            <w:pPr>
+              <w:tabs>
+                <w:tab w:val="left" w:pos="567"/>
+              </w:tabs>
+              <w:jc w:val="center"/>
+              <w:rPr>
+                <w:rFonts w:asciiTheme="minorHAnsi" w:hAnsiTheme="minorHAnsi" w:cstheme="minorHAnsi"/>
+                <w:sz w:val="22"/>
+                <w:szCs w:val="22"/>
+                <w:lang w:val="pt-BR"/>
+              </w:rPr>
+            </w:pPr>
+            <w:proofErr w:type="gramStart"/>
+            <w:r>
+              <w:rPr>
+                <w:rFonts w:asciiTheme="minorHAnsi" w:hAnsiTheme="minorHAnsi" w:cstheme="minorHAnsi"/>
+                <w:sz w:val="22"/>
+                <w:szCs w:val="22"/>
+                <w:lang w:val="pt-BR"/>
+              </w:rPr>
+              <w:t xml:space="preserve">{{ </w:t>
+            </w:r>
+            <w:proofErr w:type="spellStart"/>
+            <w:r>
+              <w:rPr>
+                <w:rFonts w:asciiTheme="minorHAnsi" w:hAnsiTheme="minorHAnsi" w:cstheme="minorHAnsi"/>
+                <w:sz w:val="22"/>
+                <w:szCs w:val="22"/>
+                <w:lang w:val="pt-BR"/>
+              </w:rPr>
+              <w:t>t</w:t>
+            </w:r>
+            <w:proofErr w:type="gramEnd"/>
+            <w:r>
+              <w:rPr>
+                <w:rFonts w:asciiTheme="minorHAnsi" w:hAnsiTheme="minorHAnsi" w:cstheme="minorHAnsi"/>
+                <w:sz w:val="22"/>
+                <w:szCs w:val="22"/>
+                <w:lang w:val="pt-BR"/>
+              </w:rPr>
+              <w:t>.valor</w:t>
+            </w:r>
+            <w:proofErr w:type="spellEnd"/>
+            <w:r>
+              <w:rPr>
+                <w:rFonts w:asciiTheme="minorHAnsi" w:hAnsiTheme="minorHAnsi" w:cstheme="minorHAnsi"/>
+                <w:sz w:val="22"/>
+                <w:szCs w:val="22"/>
+                <w:lang w:val="pt-BR"/>
+              </w:rPr>
+              <w:t xml:space="preserve"> }}</w:t>
+            </w:r>
+          </w:p>
+        </w:tc>
+        <w:tc>
+          <w:tcPr>
+            <w:tcW w:w="1175" w:type="dxa"/>
+            <w:vAlign w:val="center"/>
+          </w:tcPr>
+          <w:p>
+            <w:pPr>
+              <w:tabs>
+                <w:tab w:val="left" w:pos="567"/>
+              </w:tabs>
+              <w:jc w:val="center"/>
+              <w:rPr>
+                <w:rFonts w:asciiTheme="minorHAnsi" w:hAnsiTheme="minorHAnsi" w:cstheme="minorHAnsi"/>
+                <w:sz w:val="22"/>
+                <w:szCs w:val="22"/>
+                <w:lang w:val="pt-BR"/>
+              </w:rPr>
+            </w:pPr>
+            <w:proofErr w:type="gramStart"/>
+            <w:r>
+              <w:rPr>
+                <w:rFonts w:asciiTheme="minorHAnsi" w:hAnsiTheme="minorHAnsi" w:cstheme="minorHAnsi"/>
+                <w:sz w:val="22"/>
+                <w:szCs w:val="22"/>
+                <w:lang w:val="pt-BR"/>
+              </w:rPr>
+              <w:t xml:space="preserve">{{ </w:t>
+            </w:r>
+            <w:proofErr w:type="spellStart"/>
+            <w:r>
+              <w:rPr>
+                <w:rFonts w:asciiTheme="minorHAnsi" w:hAnsiTheme="minorHAnsi" w:cstheme="minorHAnsi"/>
+                <w:sz w:val="22"/>
+                <w:szCs w:val="22"/>
+                <w:lang w:val="pt-BR"/>
+              </w:rPr>
+              <w:t>t</w:t>
+            </w:r>
+            <w:proofErr w:type="gramEnd"/>
+            <w:r>
+              <w:rPr>
+                <w:rFonts w:asciiTheme="minorHAnsi" w:hAnsiTheme="minorHAnsi" w:cstheme="minorHAnsi"/>
+                <w:sz w:val="22"/>
+                <w:szCs w:val="22"/>
+                <w:lang w:val="pt-BR"/>
+              </w:rPr>
+              <w:t>.vencimento</w:t>
+            </w:r>
+            <w:proofErr w:type="spellEnd"/>
+            <w:r>
+              <w:rPr>
+                <w:rFonts w:asciiTheme="minorHAnsi" w:hAnsiTheme="minorHAnsi" w:cstheme="minorHAnsi"/>
+                <w:sz w:val="22"/>
+                <w:szCs w:val="22"/>
+                <w:lang w:val="pt-BR"/>
+              </w:rPr>
+              <w:t xml:space="preserve"> }}</w:t>
+            </w:r>
+          </w:p>
+        </w:tc>
+        <w:tc>
+          <w:tcPr>
+            <w:tcW w:w="1848" w:type="dxa"/>
+            <w:vAlign w:val="center"/>
+          </w:tcPr>
+          <w:p>
+            <w:pPr>
+              <w:tabs>
+                <w:tab w:val="left" w:pos="567"/>
+              </w:tabs>
+              <w:jc w:val="center"/>
+              <w:rPr>
+                <w:rFonts w:asciiTheme="minorHAnsi" w:hAnsiTheme="minorHAnsi" w:cstheme="minorHAnsi"/>
+                <w:sz w:val="22"/>
+                <w:szCs w:val="22"/>
+                <w:lang w:val="pt-BR"/>
+              </w:rPr>
+            </w:pPr>
+            <w:proofErr w:type="gramStart"/>
+            <w:r>
+              <w:rPr>
+                <w:rFonts w:asciiTheme="minorHAnsi" w:hAnsiTheme="minorHAnsi" w:cstheme="minorHAnsi"/>
+                <w:sz w:val="22"/>
+                <w:szCs w:val="22"/>
+                <w:lang w:val="pt-BR"/>
+              </w:rPr>
+              <w:t xml:space="preserve">{{ </w:t>
+            </w:r>
+            <w:proofErr w:type="spellStart"/>
+            <w:r>
+              <w:rPr>
+                <w:rFonts w:asciiTheme="minorHAnsi" w:hAnsiTheme="minorHAnsi" w:cstheme="minorHAnsi"/>
+                <w:sz w:val="22"/>
+                <w:szCs w:val="22"/>
+                <w:lang w:val="pt-BR"/>
+              </w:rPr>
+              <w:t>t</w:t>
+            </w:r>
+            <w:proofErr w:type="gramEnd"/>
+            <w:r>
+              <w:rPr>
+                <w:rFonts w:asciiTheme="minorHAnsi" w:hAnsiTheme="minorHAnsi" w:cstheme="minorHAnsi"/>
+                <w:sz w:val="22"/>
+                <w:szCs w:val="22"/>
+                <w:lang w:val="pt-BR"/>
+              </w:rPr>
+              <w:t>.tipo</w:t>
+            </w:r>
+            <w:proofErr w:type="spellEnd"/>
+            <w:r>
+              <w:rPr>
+                <w:rFonts w:asciiTheme="minorHAnsi" w:hAnsiTheme="minorHAnsi" w:cstheme="minorHAnsi"/>
+                <w:sz w:val="22"/>
+                <w:szCs w:val="22"/>
+                <w:lang w:val="pt-BR"/>
+              </w:rPr>
+              <w:t xml:space="preserve"> }}</w:t>
+            </w:r>
+          </w:p>
+        </w:tc>
+      </w:tr>
+      <w:tr>
+        <w:trPr>
+          <w:trHeight w:val="113"/>
+        </w:trPr>
+        <w:tc>
+          <w:tcPr>
+            <w:tcW w:w="2512" w:type="dxa"/>
+            <w:vAlign w:val="center"/>
+          </w:tcPr>
+          <w:p>
+            <w:pPr>
+              <w:tabs>
+                <w:tab w:val="left" w:pos="567"/>
+              </w:tabs>
+              <w:jc w:val="center"/>
+              <w:rPr>
+                <w:rFonts w:asciiTheme="minorHAnsi" w:hAnsiTheme="minorHAnsi" w:cstheme="minorHAnsi"/>
+                <w:sz w:val="22"/>
+                <w:szCs w:val="22"/>
+              </w:rPr>
+            </w:pPr>
+            <w:r>
+              <w:rPr>
+                <w:rFonts w:asciiTheme="minorHAnsi" w:hAnsiTheme="minorHAnsi" w:cstheme="minorHAnsi"/>
+                <w:sz w:val="22"/>
+                <w:szCs w:val="22"/>
+              </w:rPr>
+              <w:t xml:space="preserve">{%tr </w:t>
+            </w:r>
+            <w:proofErr w:type="spellStart"/>
+            <w:r>
+              <w:rPr>
+                <w:rFonts w:asciiTheme="minorHAnsi" w:hAnsiTheme="minorHAnsi" w:cstheme="minorHAnsi"/>
+                <w:sz w:val="22"/>
+                <w:szCs w:val="22"/>
+              </w:rPr>
+              <w:t>endfor</w:t>
+            </w:r>
+            <w:proofErr w:type="spellEnd"/>
+            <w:r>
+              <w:rPr>
+                <w:rFonts w:asciiTheme="minorHAnsi" w:hAnsiTheme="minorHAnsi" w:cstheme="minorHAnsi"/>
+                <w:sz w:val="22"/>
+                <w:szCs w:val="22"/>
+              </w:rPr>
+              <w:t xml:space="preserve"> %}</w:t>
+            </w:r>
+          </w:p>
+        </w:tc>
+        <w:tc>
+          <w:tcPr>
+            <w:tcW w:w="2161" w:type="dxa"/>
+            <w:vAlign w:val="center"/>
+          </w:tcPr>
+          <w:p>
+            <w:pPr>
+              <w:tabs>
+                <w:tab w:val="left" w:pos="567"/>
+              </w:tabs>
+              <w:jc w:val="center"/>
+              <w:rPr>
+                <w:rFonts w:asciiTheme="minorHAnsi" w:hAnsiTheme="minorHAnsi" w:cstheme="minorHAnsi"/>
+                <w:sz w:val="22"/>
+                <w:szCs w:val="22"/>
+                <w:lang w:val="pt-BR"/>
+              </w:rPr>
+            </w:pPr>
+          </w:p>
+        </w:tc>
+        <w:tc>
+          <w:tcPr>
+            <w:tcW w:w="1701" w:type="dxa"/>
+            <w:vAlign w:val="center"/>
+          </w:tcPr>
+          <w:p>
+            <w:pPr>
+              <w:tabs>
+                <w:tab w:val="left" w:pos="567"/>
+              </w:tabs>
+              <w:jc w:val="center"/>
+              <w:rPr>
+                <w:rFonts w:asciiTheme="minorHAnsi" w:hAnsiTheme="minorHAnsi" w:cstheme="minorHAnsi"/>
+                <w:sz w:val="22"/>
+                <w:szCs w:val="22"/>
+                <w:lang w:val="pt-BR"/>
+              </w:rPr>
+            </w:pPr>
+          </w:p>
+        </w:tc>
+        <w:tc>
+          <w:tcPr>
+            <w:tcW w:w="1175" w:type="dxa"/>
+            <w:vAlign w:val="center"/>
+          </w:tcPr>
+          <w:p>
+            <w:pPr>
+              <w:tabs>
+                <w:tab w:val="left" w:pos="567"/>
+              </w:tabs>
+              <w:jc w:val="center"/>
+              <w:rPr>
+                <w:rFonts w:asciiTheme="minorHAnsi" w:hAnsiTheme="minorHAnsi" w:cstheme="minorHAnsi"/>
+                <w:sz w:val="22"/>
+                <w:szCs w:val="22"/>
+                <w:lang w:val="pt-BR"/>
+              </w:rPr>
+            </w:pPr>
+          </w:p>
+        </w:tc>
+        <w:tc>
+          <w:tcPr>
+            <w:tcW w:w="1848" w:type="dxa"/>
+            <w:vAlign w:val="center"/>
+          </w:tcPr>
+          <w:p>
+            <w:pPr>
+              <w:tabs>
+                <w:tab w:val="left" w:pos="567"/>
+              </w:tabs>
+              <w:jc w:val="center"/>
+              <w:rPr>
+                <w:rFonts w:asciiTheme="minorHAnsi" w:hAnsiTheme="minorHAnsi" w:cstheme="minorHAnsi"/>
+                <w:sz w:val="22"/>
+                <w:szCs w:val="22"/>
+                <w:lang w:val="pt-BR"/>
+              </w:rPr>
+            </w:pPr>
+          </w:p>
+        </w:tc>
+      </w:tr>
+    </w:tbl>
     <w:p>
       <w:pPr>
-        <w:pStyle w:val="PargrafodaLista"/>
         <w:tabs>
           <w:tab w:val="left" w:pos="567"/>
         </w:tabs>
         <w:spacing w:after="240"/>
-        <w:ind w:left="0"/>
-        <w:jc w:val="center"/>
+        <w:jc w:val="both"/>
         <w:rPr>
           <w:rFonts w:asciiTheme="minorHAnsi" w:hAnsiTheme="minorHAnsi" w:cstheme="minorHAnsi"/>
           <w:sz w:val="22"/>
@@ -666,32 +1418,15 @@
           <w:lang w:val="pt-BR"/>
         </w:rPr>
       </w:pPr>
-      <w:bookmarkStart w:id="0" w:name="Teste"/>
-      <w:r>
-        <w:rPr>
-          <w:rFonts w:asciiTheme="minorHAnsi" w:hAnsiTheme="minorHAnsi" w:cstheme="minorHAnsi"/>
-          <w:sz w:val="22"/>
-          <w:szCs w:val="22"/>
-          <w:lang w:val="pt-BR"/>
-        </w:rPr>
-        <w:t>[•]</w:t>
-      </w:r>
-    </w:p>
-    <w:bookmarkEnd w:id="0"/>
-    <w:p>
-      <w:pPr>
-        <w:pStyle w:val="PargrafodaLista"/>
-        <w:tabs>
-          <w:tab w:val="left" w:pos="567"/>
-        </w:tabs>
-        <w:ind w:left="0"/>
-        <w:rPr>
-          <w:rFonts w:asciiTheme="minorHAnsi" w:hAnsiTheme="minorHAnsi" w:cstheme="minorHAnsi"/>
-          <w:sz w:val="22"/>
-          <w:szCs w:val="22"/>
-          <w:lang w:val="pt-BR"/>
-        </w:rPr>
-      </w:pPr>
+      <w:r>
+        <w:rPr>
+          <w:rFonts w:asciiTheme="minorHAnsi" w:hAnsiTheme="minorHAnsi" w:cstheme="minorHAnsi"/>
+          <w:sz w:val="22"/>
+          <w:szCs w:val="22"/>
+          <w:lang w:val="pt-BR"/>
+        </w:rPr>
+        <w:t xml:space="preserve"> </w:t>
+      </w:r>
     </w:p>
     <w:p>
       <w:pPr>
@@ -772,34 +1507,41 @@
                 <w:lang w:val="pt-BR"/>
               </w:rPr>
             </w:pPr>
-            <w:r>
-              <w:rPr>
-                <w:rFonts w:asciiTheme="minorHAnsi" w:hAnsiTheme="minorHAnsi" w:cstheme="minorHAnsi"/>
-                <w:sz w:val="22"/>
-                <w:szCs w:val="22"/>
-                <w:lang w:val="pt-BR"/>
-              </w:rPr>
-              <w:t xml:space="preserve">R$ </w:t>
-            </w:r>
-            <w:bookmarkStart w:id="1" w:name="Total"/>
-            <w:r>
-              <w:rPr>
-                <w:rFonts w:asciiTheme="minorHAnsi" w:hAnsiTheme="minorHAnsi" w:cstheme="minorHAnsi"/>
-                <w:sz w:val="22"/>
-                <w:szCs w:val="22"/>
-                <w:lang w:val="pt-BR"/>
-              </w:rPr>
-              <w:t>[•]</w:t>
-            </w:r>
-            <w:bookmarkEnd w:id="1"/>
-            <w:r>
-              <w:rPr>
-                <w:rFonts w:asciiTheme="minorHAnsi" w:hAnsiTheme="minorHAnsi" w:cstheme="minorHAnsi"/>
-                <w:sz w:val="22"/>
-                <w:szCs w:val="22"/>
-                <w:lang w:val="pt-BR"/>
-              </w:rPr>
-              <w:t>,00</w:t>
+            <w:proofErr w:type="gramStart"/>
+            <w:r>
+              <w:rPr>
+                <w:rFonts w:asciiTheme="minorHAnsi" w:hAnsiTheme="minorHAnsi" w:cstheme="minorHAnsi"/>
+                <w:sz w:val="22"/>
+                <w:szCs w:val="22"/>
+              </w:rPr>
+              <w:t xml:space="preserve">{{ </w:t>
+            </w:r>
+            <w:proofErr w:type="spellStart"/>
+            <w:r>
+              <w:rPr>
+                <w:rFonts w:asciiTheme="minorHAnsi" w:hAnsiTheme="minorHAnsi" w:cstheme="minorHAnsi"/>
+                <w:sz w:val="22"/>
+                <w:szCs w:val="22"/>
+              </w:rPr>
+              <w:t>valor</w:t>
+            </w:r>
+            <w:proofErr w:type="gramEnd"/>
+            <w:r>
+              <w:rPr>
+                <w:rFonts w:asciiTheme="minorHAnsi" w:hAnsiTheme="minorHAnsi" w:cstheme="minorHAnsi"/>
+                <w:sz w:val="22"/>
+                <w:szCs w:val="22"/>
+              </w:rPr>
+              <w:t>_total</w:t>
+            </w:r>
+            <w:proofErr w:type="spellEnd"/>
+            <w:r>
+              <w:rPr>
+                <w:rFonts w:asciiTheme="minorHAnsi" w:hAnsiTheme="minorHAnsi" w:cstheme="minorHAnsi"/>
+                <w:sz w:val="22"/>
+                <w:szCs w:val="22"/>
+              </w:rPr>
+              <w:t xml:space="preserve"> }}</w:t>
             </w:r>
           </w:p>
         </w:tc>
@@ -1084,43 +1826,42 @@
                 <w:lang w:val="pt-BR"/>
               </w:rPr>
             </w:pPr>
-            <w:r>
-              <w:rPr>
-                <w:rFonts w:asciiTheme="minorHAnsi" w:hAnsiTheme="minorHAnsi" w:cstheme="minorHAnsi"/>
-                <w:sz w:val="22"/>
-                <w:szCs w:val="22"/>
-                <w:lang w:val="pt-BR"/>
-              </w:rPr>
-              <w:t xml:space="preserve">R$ </w:t>
-            </w:r>
-            <w:bookmarkStart w:id="2" w:name="Preco"/>
-            <w:r>
-              <w:rPr>
-                <w:rFonts w:asciiTheme="minorHAnsi" w:hAnsiTheme="minorHAnsi" w:cstheme="minorHAnsi"/>
-                <w:sz w:val="22"/>
-                <w:szCs w:val="22"/>
-                <w:lang w:val="pt-BR"/>
-              </w:rPr>
-              <w:t>[</w:t>
-            </w:r>
-            <w:r>
-              <w:rPr>
-                <w:rFonts w:asciiTheme="minorHAnsi" w:hAnsiTheme="minorHAnsi" w:cstheme="minorHAnsi"/>
-                <w:sz w:val="22"/>
-                <w:szCs w:val="22"/>
-              </w:rPr>
-              <w:sym w:font="Symbol" w:char="F0B7"/>
-            </w:r>
-            <w:r>
-              <w:rPr>
-                <w:rFonts w:asciiTheme="minorHAnsi" w:hAnsiTheme="minorHAnsi" w:cstheme="minorHAnsi"/>
-                <w:sz w:val="22"/>
-                <w:szCs w:val="22"/>
-                <w:lang w:val="pt-BR"/>
-              </w:rPr>
-              <w:t>]</w:t>
-            </w:r>
-            <w:bookmarkEnd w:id="2"/>
+            <w:proofErr w:type="gramStart"/>
+            <w:r>
+              <w:rPr>
+                <w:rFonts w:asciiTheme="minorHAnsi" w:hAnsiTheme="minorHAnsi" w:cstheme="minorHAnsi"/>
+                <w:sz w:val="22"/>
+                <w:szCs w:val="22"/>
+              </w:rPr>
+              <w:t xml:space="preserve">{{ </w:t>
+            </w:r>
+            <w:proofErr w:type="spellStart"/>
+            <w:r>
+              <w:rPr>
+                <w:rFonts w:asciiTheme="minorHAnsi" w:hAnsiTheme="minorHAnsi" w:cstheme="minorHAnsi"/>
+                <w:sz w:val="22"/>
+                <w:szCs w:val="22"/>
+              </w:rPr>
+              <w:t>preco</w:t>
+            </w:r>
+            <w:proofErr w:type="gramEnd"/>
+            <w:r>
+              <w:rPr>
+                <w:rFonts w:asciiTheme="minorHAnsi" w:hAnsiTheme="minorHAnsi" w:cstheme="minorHAnsi"/>
+                <w:sz w:val="22"/>
+                <w:szCs w:val="22"/>
+              </w:rPr>
+              <w:t>_aquisicao</w:t>
+            </w:r>
+            <w:proofErr w:type="spellEnd"/>
+            <w:r>
+              <w:rPr>
+                <w:rFonts w:asciiTheme="minorHAnsi" w:hAnsiTheme="minorHAnsi" w:cstheme="minorHAnsi"/>
+                <w:sz w:val="22"/>
+                <w:szCs w:val="22"/>
+              </w:rPr>
+              <w:t xml:space="preserve"> }}</w:t>
+            </w:r>
           </w:p>
         </w:tc>
       </w:tr>
@@ -1181,17 +1922,42 @@
                 <w:lang w:val="pt-BR"/>
               </w:rPr>
             </w:pPr>
-            <w:bookmarkStart w:id="3" w:name="Data"/>
-            <w:r>
-              <w:rPr>
-                <w:rFonts w:asciiTheme="minorHAnsi" w:hAnsiTheme="minorHAnsi" w:cstheme="minorHAnsi"/>
-                <w:sz w:val="22"/>
-                <w:szCs w:val="22"/>
-                <w:lang w:val="pt-BR"/>
-              </w:rPr>
-              <w:t>[•]</w:t>
-            </w:r>
-            <w:bookmarkEnd w:id="3"/>
+            <w:proofErr w:type="gramStart"/>
+            <w:r>
+              <w:rPr>
+                <w:rFonts w:asciiTheme="minorHAnsi" w:hAnsiTheme="minorHAnsi" w:cstheme="minorHAnsi"/>
+                <w:sz w:val="22"/>
+                <w:szCs w:val="22"/>
+              </w:rPr>
+              <w:t xml:space="preserve">{{ </w:t>
+            </w:r>
+            <w:proofErr w:type="spellStart"/>
+            <w:r>
+              <w:rPr>
+                <w:rFonts w:asciiTheme="minorHAnsi" w:hAnsiTheme="minorHAnsi" w:cstheme="minorHAnsi"/>
+                <w:sz w:val="22"/>
+                <w:szCs w:val="22"/>
+              </w:rPr>
+              <w:t>data</w:t>
+            </w:r>
+            <w:proofErr w:type="gramEnd"/>
+            <w:r>
+              <w:rPr>
+                <w:rFonts w:asciiTheme="minorHAnsi" w:hAnsiTheme="minorHAnsi" w:cstheme="minorHAnsi"/>
+                <w:sz w:val="22"/>
+                <w:szCs w:val="22"/>
+              </w:rPr>
+              <w:t>_aquisicao</w:t>
+            </w:r>
+            <w:proofErr w:type="spellEnd"/>
+            <w:r>
+              <w:rPr>
+                <w:rFonts w:asciiTheme="minorHAnsi" w:hAnsiTheme="minorHAnsi" w:cstheme="minorHAnsi"/>
+                <w:sz w:val="22"/>
+                <w:szCs w:val="22"/>
+              </w:rPr>
+              <w:t xml:space="preserve"> }}</w:t>
+            </w:r>
           </w:p>
         </w:tc>
       </w:tr>
@@ -1278,34 +2044,42 @@
                 <w:lang w:val="pt-BR"/>
               </w:rPr>
             </w:pPr>
-            <w:bookmarkStart w:id="4" w:name="Banco"/>
-            <w:r>
-              <w:rPr>
-                <w:rFonts w:asciiTheme="minorHAnsi" w:hAnsiTheme="minorHAnsi" w:cstheme="minorHAnsi"/>
-                <w:sz w:val="22"/>
-                <w:szCs w:val="22"/>
-                <w:lang w:val="pt-BR"/>
-              </w:rPr>
-              <w:t>[</w:t>
-            </w:r>
-            <w:r>
-              <w:rPr>
-                <w:rFonts w:asciiTheme="minorHAnsi" w:hAnsiTheme="minorHAnsi" w:cstheme="minorHAnsi"/>
-                <w:sz w:val="22"/>
-                <w:szCs w:val="22"/>
-              </w:rPr>
-              <w:sym w:font="Symbol" w:char="F0B7"/>
-            </w:r>
-            <w:r>
-              <w:rPr>
-                <w:rFonts w:asciiTheme="minorHAnsi" w:hAnsiTheme="minorHAnsi" w:cstheme="minorHAnsi"/>
-                <w:sz w:val="22"/>
-                <w:szCs w:val="22"/>
-                <w:lang w:val="pt-BR"/>
-              </w:rPr>
-              <w:t>]</w:t>
-            </w:r>
-            <w:bookmarkEnd w:id="4"/>
+            <w:proofErr w:type="gramStart"/>
+            <w:r>
+              <w:rPr>
+                <w:rFonts w:asciiTheme="minorHAnsi" w:hAnsiTheme="minorHAnsi" w:cstheme="minorHAnsi"/>
+                <w:sz w:val="22"/>
+                <w:szCs w:val="22"/>
+              </w:rPr>
+              <w:t xml:space="preserve">{{ </w:t>
+            </w:r>
+            <w:proofErr w:type="spellStart"/>
+            <w:r>
+              <w:rPr>
+                <w:rFonts w:asciiTheme="minorHAnsi" w:hAnsiTheme="minorHAnsi" w:cstheme="minorHAnsi"/>
+                <w:sz w:val="22"/>
+                <w:szCs w:val="22"/>
+              </w:rPr>
+              <w:t>banco</w:t>
+            </w:r>
+            <w:proofErr w:type="gramEnd"/>
+            <w:r>
+              <w:rPr>
+                <w:rFonts w:asciiTheme="minorHAnsi" w:hAnsiTheme="minorHAnsi" w:cstheme="minorHAnsi"/>
+                <w:sz w:val="22"/>
+                <w:szCs w:val="22"/>
+              </w:rPr>
+              <w:t>_aquisicao</w:t>
+            </w:r>
+            <w:proofErr w:type="spellEnd"/>
+            <w:r>
+              <w:rPr>
+                <w:rFonts w:asciiTheme="minorHAnsi" w:hAnsiTheme="minorHAnsi" w:cstheme="minorHAnsi"/>
+                <w:sz w:val="22"/>
+                <w:szCs w:val="22"/>
+              </w:rPr>
+              <w:t xml:space="preserve"> }}</w:t>
+            </w:r>
           </w:p>
         </w:tc>
       </w:tr>
@@ -1373,34 +2147,42 @@
                 <w:lang w:val="pt-BR"/>
               </w:rPr>
             </w:pPr>
-            <w:bookmarkStart w:id="5" w:name="Agencia"/>
-            <w:r>
-              <w:rPr>
-                <w:rFonts w:asciiTheme="minorHAnsi" w:hAnsiTheme="minorHAnsi" w:cstheme="minorHAnsi"/>
-                <w:sz w:val="22"/>
-                <w:szCs w:val="22"/>
-                <w:lang w:val="pt-BR"/>
-              </w:rPr>
-              <w:t>[</w:t>
-            </w:r>
-            <w:r>
-              <w:rPr>
-                <w:rFonts w:asciiTheme="minorHAnsi" w:hAnsiTheme="minorHAnsi" w:cstheme="minorHAnsi"/>
-                <w:sz w:val="22"/>
-                <w:szCs w:val="22"/>
-              </w:rPr>
-              <w:sym w:font="Symbol" w:char="F0B7"/>
-            </w:r>
-            <w:r>
-              <w:rPr>
-                <w:rFonts w:asciiTheme="minorHAnsi" w:hAnsiTheme="minorHAnsi" w:cstheme="minorHAnsi"/>
-                <w:sz w:val="22"/>
-                <w:szCs w:val="22"/>
-                <w:lang w:val="pt-BR"/>
-              </w:rPr>
-              <w:t>]</w:t>
-            </w:r>
-            <w:bookmarkEnd w:id="5"/>
+            <w:proofErr w:type="gramStart"/>
+            <w:r>
+              <w:rPr>
+                <w:rFonts w:asciiTheme="minorHAnsi" w:hAnsiTheme="minorHAnsi" w:cstheme="minorHAnsi"/>
+                <w:sz w:val="22"/>
+                <w:szCs w:val="22"/>
+              </w:rPr>
+              <w:t xml:space="preserve">{{ </w:t>
+            </w:r>
+            <w:proofErr w:type="spellStart"/>
+            <w:r>
+              <w:rPr>
+                <w:rFonts w:asciiTheme="minorHAnsi" w:hAnsiTheme="minorHAnsi" w:cstheme="minorHAnsi"/>
+                <w:sz w:val="22"/>
+                <w:szCs w:val="22"/>
+              </w:rPr>
+              <w:t>agencia</w:t>
+            </w:r>
+            <w:proofErr w:type="gramEnd"/>
+            <w:r>
+              <w:rPr>
+                <w:rFonts w:asciiTheme="minorHAnsi" w:hAnsiTheme="minorHAnsi" w:cstheme="minorHAnsi"/>
+                <w:sz w:val="22"/>
+                <w:szCs w:val="22"/>
+              </w:rPr>
+              <w:t>_aquisicao</w:t>
+            </w:r>
+            <w:proofErr w:type="spellEnd"/>
+            <w:r>
+              <w:rPr>
+                <w:rFonts w:asciiTheme="minorHAnsi" w:hAnsiTheme="minorHAnsi" w:cstheme="minorHAnsi"/>
+                <w:sz w:val="22"/>
+                <w:szCs w:val="22"/>
+              </w:rPr>
+              <w:t xml:space="preserve"> }}</w:t>
+            </w:r>
           </w:p>
         </w:tc>
       </w:tr>
@@ -1468,34 +2250,42 @@
                 <w:lang w:val="pt-BR"/>
               </w:rPr>
             </w:pPr>
-            <w:bookmarkStart w:id="6" w:name="Conta"/>
-            <w:r>
-              <w:rPr>
-                <w:rFonts w:asciiTheme="minorHAnsi" w:hAnsiTheme="minorHAnsi" w:cstheme="minorHAnsi"/>
-                <w:sz w:val="22"/>
-                <w:szCs w:val="22"/>
-                <w:lang w:val="pt-BR"/>
-              </w:rPr>
-              <w:t>[</w:t>
-            </w:r>
-            <w:r>
-              <w:rPr>
-                <w:rFonts w:asciiTheme="minorHAnsi" w:hAnsiTheme="minorHAnsi" w:cstheme="minorHAnsi"/>
-                <w:sz w:val="22"/>
-                <w:szCs w:val="22"/>
-              </w:rPr>
-              <w:sym w:font="Symbol" w:char="F0B7"/>
-            </w:r>
-            <w:r>
-              <w:rPr>
-                <w:rFonts w:asciiTheme="minorHAnsi" w:hAnsiTheme="minorHAnsi" w:cstheme="minorHAnsi"/>
-                <w:sz w:val="22"/>
-                <w:szCs w:val="22"/>
-                <w:lang w:val="pt-BR"/>
-              </w:rPr>
-              <w:t>]</w:t>
-            </w:r>
-            <w:bookmarkEnd w:id="6"/>
+            <w:proofErr w:type="gramStart"/>
+            <w:r>
+              <w:rPr>
+                <w:rFonts w:asciiTheme="minorHAnsi" w:hAnsiTheme="minorHAnsi" w:cstheme="minorHAnsi"/>
+                <w:sz w:val="22"/>
+                <w:szCs w:val="22"/>
+              </w:rPr>
+              <w:t xml:space="preserve">{{ </w:t>
+            </w:r>
+            <w:proofErr w:type="spellStart"/>
+            <w:r>
+              <w:rPr>
+                <w:rFonts w:asciiTheme="minorHAnsi" w:hAnsiTheme="minorHAnsi" w:cstheme="minorHAnsi"/>
+                <w:sz w:val="22"/>
+                <w:szCs w:val="22"/>
+              </w:rPr>
+              <w:t>conta</w:t>
+            </w:r>
+            <w:proofErr w:type="gramEnd"/>
+            <w:r>
+              <w:rPr>
+                <w:rFonts w:asciiTheme="minorHAnsi" w:hAnsiTheme="minorHAnsi" w:cstheme="minorHAnsi"/>
+                <w:sz w:val="22"/>
+                <w:szCs w:val="22"/>
+              </w:rPr>
+              <w:t>_aquisicao</w:t>
+            </w:r>
+            <w:proofErr w:type="spellEnd"/>
+            <w:r>
+              <w:rPr>
+                <w:rFonts w:asciiTheme="minorHAnsi" w:hAnsiTheme="minorHAnsi" w:cstheme="minorHAnsi"/>
+                <w:sz w:val="22"/>
+                <w:szCs w:val="22"/>
+              </w:rPr>
+              <w:t xml:space="preserve"> }}</w:t>
+            </w:r>
           </w:p>
         </w:tc>
       </w:tr>
@@ -1646,7 +2436,7 @@
           <w:lang w:val="pt-BR"/>
         </w:rPr>
       </w:pPr>
-      <w:bookmarkStart w:id="7" w:name="_Ref79698615"/>
+      <w:bookmarkStart w:id="0" w:name="_Ref79698615"/>
       <w:r>
         <w:rPr>
           <w:rFonts w:asciiTheme="minorHAnsi" w:hAnsiTheme="minorHAnsi" w:cstheme="minorHAnsi"/>
@@ -1685,7 +2475,17 @@
           <w:szCs w:val="22"/>
           <w:lang w:val="pt-BR"/>
         </w:rPr>
-        <w:t xml:space="preserve"> sobre o valor total inadimplido, desde a data do vencimento até o efetivo pagamento, para as hipóteses de inadimplemento de quaisquer dos títulos acima indicados, o que caracterizará, de pleno direito e independentemente de qualquer aviso ou notificação, a mora d</w:t>
+        <w:t xml:space="preserve"> sobre o valor total inadimplido, desde a data do vencimento até o efetivo pagamento, para as hipóteses de inadimplemento de quaisquer dos títulos acima indicados, </w:t>
+      </w:r>
+      <w:r>
+        <w:rPr>
+          <w:rFonts w:asciiTheme="minorHAnsi" w:hAnsiTheme="minorHAnsi" w:cstheme="minorHAnsi"/>
+          <w:sz w:val="22"/>
+          <w:szCs w:val="22"/>
+          <w:lang w:val="pt-BR"/>
+        </w:rPr>
+        <w:lastRenderedPageBreak/>
+        <w:t>o que caracterizará, de pleno direito e independentemente de qualquer aviso ou notificação, a mora d</w:t>
       </w:r>
       <w:r>
         <w:rPr>
@@ -1705,7 +2505,7 @@
         </w:rPr>
         <w:t>inadimplente ensejando a incidência de:</w:t>
       </w:r>
-      <w:bookmarkEnd w:id="7"/>
+      <w:bookmarkEnd w:id="0"/>
     </w:p>
     <w:p>
       <w:pPr>
@@ -1815,7 +2615,6 @@
           <w:szCs w:val="22"/>
           <w:lang w:val="pt-BR"/>
         </w:rPr>
-        <w:lastRenderedPageBreak/>
         <w:t>juros remuneratórios de 1% (um por cento) ao mês, calculados pro rata die desde a data do vencimento até o seu efetivo pagamento (“</w:t>
       </w:r>
       <w:r>
@@ -1986,7 +2785,7 @@
           <w:lang w:val="pt-BR"/>
         </w:rPr>
       </w:pPr>
-      <w:bookmarkStart w:id="8" w:name="_Ref79698616"/>
+      <w:bookmarkStart w:id="1" w:name="_Ref79698616"/>
       <w:r>
         <w:rPr>
           <w:rFonts w:asciiTheme="minorHAnsi" w:hAnsiTheme="minorHAnsi" w:cstheme="minorHAnsi"/>
@@ -2034,7 +2833,7 @@
         </w:rPr>
         <w:t xml:space="preserve"> todas as despesas e custas incorridas para o recebimento dos valores devidos.</w:t>
       </w:r>
-      <w:bookmarkEnd w:id="8"/>
+      <w:bookmarkEnd w:id="1"/>
     </w:p>
     <w:p>
       <w:pPr>
@@ -2323,14 +3122,15 @@
           <w:lang w:val="pt-BR"/>
         </w:rPr>
       </w:pPr>
-      <w:bookmarkStart w:id="9" w:name="_Ref79698536"/>
-      <w:r>
-        <w:rPr>
-          <w:rFonts w:asciiTheme="minorHAnsi" w:hAnsiTheme="minorHAnsi" w:cstheme="minorHAnsi"/>
-          <w:sz w:val="22"/>
-          <w:szCs w:val="22"/>
-          <w:lang w:val="pt-BR"/>
-        </w:rPr>
+      <w:bookmarkStart w:id="2" w:name="_Ref79698536"/>
+      <w:r>
+        <w:rPr>
+          <w:rFonts w:asciiTheme="minorHAnsi" w:hAnsiTheme="minorHAnsi" w:cstheme="minorHAnsi"/>
+          <w:sz w:val="22"/>
+          <w:szCs w:val="22"/>
+          <w:lang w:val="pt-BR"/>
+        </w:rPr>
+        <w:lastRenderedPageBreak/>
         <w:t xml:space="preserve">As Partes acordam que na ocorrência de quaisquer das hipóteses abaixo listadas, a </w:t>
       </w:r>
       <w:r>
@@ -2413,7 +3213,7 @@
         </w:rPr>
         <w:t>:</w:t>
       </w:r>
-      <w:bookmarkEnd w:id="9"/>
+      <w:bookmarkEnd w:id="2"/>
     </w:p>
     <w:p>
       <w:pPr>
@@ -2439,7 +3239,6 @@
           <w:szCs w:val="22"/>
           <w:lang w:val="pt-BR"/>
         </w:rPr>
-        <w:lastRenderedPageBreak/>
         <w:t xml:space="preserve">caso o </w:t>
       </w:r>
       <w:r>
@@ -3202,27 +4001,7 @@
           <w:szCs w:val="22"/>
           <w:lang w:val="pt-BR"/>
         </w:rPr>
-        <w:t xml:space="preserve">a qualquer serviço de proteção ao crédito, como o Serasa </w:t>
-      </w:r>
-      <w:proofErr w:type="spellStart"/>
-      <w:r>
-        <w:rPr>
-          <w:rFonts w:asciiTheme="minorHAnsi" w:hAnsiTheme="minorHAnsi" w:cstheme="minorHAnsi"/>
-          <w:sz w:val="22"/>
-          <w:szCs w:val="22"/>
-          <w:lang w:val="pt-BR"/>
-        </w:rPr>
-        <w:t>Experian</w:t>
-      </w:r>
-      <w:proofErr w:type="spellEnd"/>
-      <w:r>
-        <w:rPr>
-          <w:rFonts w:asciiTheme="minorHAnsi" w:hAnsiTheme="minorHAnsi" w:cstheme="minorHAnsi"/>
-          <w:sz w:val="22"/>
-          <w:szCs w:val="22"/>
-          <w:lang w:val="pt-BR"/>
-        </w:rPr>
-        <w:t xml:space="preserve"> ou qualquer outro órgão encarregado de cadastrar atraso nos pagamentos e/ou descumprimento de obrigações contratuais</w:t>
+        <w:t>a qualquer serviço de proteção ao crédito, como o Serasa Experian ou qualquer outro órgão encarregado de cadastrar atraso nos pagamentos e/ou descumprimento de obrigações contratuais</w:t>
       </w:r>
       <w:r>
         <w:rPr>
@@ -3373,7 +4152,7 @@
         </w:rPr>
         <w:t xml:space="preserve"> neste ato.</w:t>
       </w:r>
-      <w:bookmarkStart w:id="10" w:name="_Hlk74606228"/>
+      <w:bookmarkStart w:id="3" w:name="_Hlk74606228"/>
     </w:p>
     <w:p>
       <w:pPr>
@@ -3432,6 +4211,7 @@
           <w:szCs w:val="22"/>
           <w:lang w:val="pt-BR"/>
         </w:rPr>
+        <w:lastRenderedPageBreak/>
         <w:t xml:space="preserve">As Partes acordam que </w:t>
       </w:r>
       <w:r>
@@ -3508,7 +4288,7 @@
         </w:rPr>
         <w:t>.</w:t>
       </w:r>
-      <w:bookmarkEnd w:id="10"/>
+      <w:bookmarkEnd w:id="3"/>
     </w:p>
     <w:p>
       <w:pPr>
@@ -3537,7 +4317,6 @@
           <w:szCs w:val="22"/>
           <w:lang w:val="pt-BR"/>
         </w:rPr>
-        <w:lastRenderedPageBreak/>
         <w:t xml:space="preserve">O presente instrumento é assinado em caráter irrevogável e irretratável, </w:t>
       </w:r>
       <w:r>
@@ -3847,42 +4626,65 @@
         </w:rPr>
         <w:t xml:space="preserve">, </w:t>
       </w:r>
-      <w:bookmarkStart w:id="11" w:name="Data_Contrato"/>
-      <w:r>
-        <w:rPr>
-          <w:rFonts w:asciiTheme="minorHAnsi" w:hAnsiTheme="minorHAnsi" w:cstheme="minorHAnsi"/>
-          <w:sz w:val="22"/>
-          <w:szCs w:val="22"/>
-          <w:lang w:val="pt-BR"/>
-        </w:rPr>
-        <w:t>[</w:t>
-      </w:r>
-      <w:r>
-        <w:rPr>
-          <w:rFonts w:asciiTheme="minorHAnsi" w:hAnsiTheme="minorHAnsi" w:cstheme="minorHAnsi"/>
-          <w:sz w:val="22"/>
-          <w:szCs w:val="22"/>
-        </w:rPr>
-        <w:sym w:font="Symbol" w:char="F0B7"/>
-      </w:r>
-      <w:r>
-        <w:rPr>
-          <w:rFonts w:asciiTheme="minorHAnsi" w:hAnsiTheme="minorHAnsi" w:cstheme="minorHAnsi"/>
-          <w:sz w:val="22"/>
-          <w:szCs w:val="22"/>
-          <w:lang w:val="pt-BR"/>
-        </w:rPr>
-        <w:t>]</w:t>
-      </w:r>
-      <w:bookmarkEnd w:id="11"/>
-      <w:r>
-        <w:rPr>
-          <w:rFonts w:asciiTheme="minorHAnsi" w:hAnsiTheme="minorHAnsi" w:cstheme="minorHAnsi"/>
-          <w:sz w:val="22"/>
-          <w:szCs w:val="22"/>
-          <w:lang w:val="pt-BR"/>
-        </w:rPr>
-        <w:t xml:space="preserve"> </w:t>
+      <w:proofErr w:type="gramStart"/>
+      <w:r>
+        <w:rPr>
+          <w:rFonts w:asciiTheme="minorHAnsi" w:hAnsiTheme="minorHAnsi" w:cstheme="minorHAnsi"/>
+          <w:sz w:val="22"/>
+          <w:szCs w:val="22"/>
+          <w:lang w:val="pt-BR"/>
+        </w:rPr>
+        <w:t xml:space="preserve">{{ </w:t>
+      </w:r>
+      <w:proofErr w:type="spellStart"/>
+      <w:r>
+        <w:rPr>
+          <w:rFonts w:asciiTheme="minorHAnsi" w:hAnsiTheme="minorHAnsi" w:cstheme="minorHAnsi"/>
+          <w:sz w:val="22"/>
+          <w:szCs w:val="22"/>
+          <w:lang w:val="pt-BR"/>
+        </w:rPr>
+        <w:t>data</w:t>
+      </w:r>
+      <w:proofErr w:type="gramEnd"/>
+      <w:r>
+        <w:rPr>
+          <w:rFonts w:asciiTheme="minorHAnsi" w:hAnsiTheme="minorHAnsi" w:cstheme="minorHAnsi"/>
+          <w:sz w:val="22"/>
+          <w:szCs w:val="22"/>
+          <w:lang w:val="pt-BR"/>
+        </w:rPr>
+        <w:t>_</w:t>
+      </w:r>
+      <w:proofErr w:type="gramStart"/>
+      <w:r>
+        <w:rPr>
+          <w:rFonts w:asciiTheme="minorHAnsi" w:hAnsiTheme="minorHAnsi" w:cstheme="minorHAnsi"/>
+          <w:sz w:val="22"/>
+          <w:szCs w:val="22"/>
+          <w:lang w:val="pt-BR"/>
+        </w:rPr>
+        <w:t>atual</w:t>
+      </w:r>
+      <w:proofErr w:type="spellEnd"/>
+      <w:r>
+        <w:rPr>
+          <w:rFonts w:asciiTheme="minorHAnsi" w:hAnsiTheme="minorHAnsi" w:cstheme="minorHAnsi"/>
+          <w:sz w:val="22"/>
+          <w:szCs w:val="22"/>
+          <w:lang w:val="pt-BR"/>
+        </w:rPr>
+        <w:t xml:space="preserve"> }</w:t>
+      </w:r>
+      <w:proofErr w:type="gramEnd"/>
+      <w:r>
+        <w:rPr>
+          <w:rFonts w:asciiTheme="minorHAnsi" w:hAnsiTheme="minorHAnsi" w:cstheme="minorHAnsi"/>
+          <w:sz w:val="22"/>
+          <w:szCs w:val="22"/>
+          <w:lang w:val="pt-BR"/>
+        </w:rPr>
+        <w:t>}</w:t>
       </w:r>
     </w:p>
     <w:p>
@@ -3927,22 +4729,1129 @@
         <w:br w:type="page"/>
       </w:r>
     </w:p>
-    <w:p>
-      <w:pPr>
-        <w:rPr>
-          <w:lang w:val="pt-BR"/>
-        </w:rPr>
-      </w:pPr>
-      <w:bookmarkStart w:id="12" w:name="Cedente"/>
-      <w:r>
-        <w:rPr>
-          <w:lang w:val="pt-BR"/>
-        </w:rPr>
-        <w:lastRenderedPageBreak/>
-        <w:t>[•]</w:t>
-      </w:r>
-    </w:p>
-    <w:bookmarkEnd w:id="12"/>
+    <w:tbl>
+      <w:tblPr>
+        <w:tblW w:w="9552" w:type="dxa"/>
+        <w:tblCellMar>
+          <w:left w:w="70" w:type="dxa"/>
+          <w:right w:w="70" w:type="dxa"/>
+        </w:tblCellMar>
+        <w:tblLook w:val="04A0" w:firstRow="1" w:lastRow="0" w:firstColumn="1" w:lastColumn="0" w:noHBand="0" w:noVBand="1"/>
+      </w:tblPr>
+      <w:tblGrid>
+        <w:gridCol w:w="2095"/>
+        <w:gridCol w:w="4043"/>
+        <w:gridCol w:w="3414"/>
+      </w:tblGrid>
+      <w:tr>
+        <w:trPr>
+          <w:trHeight w:val="369"/>
+        </w:trPr>
+        <w:tc>
+          <w:tcPr>
+            <w:tcW w:w="6138" w:type="dxa"/>
+            <w:gridSpan w:val="2"/>
+            <w:tcBorders>
+              <w:top w:val="single" w:sz="4" w:space="0" w:color="auto"/>
+              <w:left w:val="single" w:sz="4" w:space="0" w:color="auto"/>
+              <w:bottom w:val="nil"/>
+              <w:right w:val="nil"/>
+            </w:tcBorders>
+            <w:noWrap/>
+            <w:vAlign w:val="bottom"/>
+            <w:hideMark/>
+          </w:tcPr>
+          <w:p>
+            <w:pPr>
+              <w:rPr>
+                <w:rFonts w:ascii="Calibri" w:hAnsi="Calibri" w:cs="Calibri"/>
+                <w:b/>
+                <w:bCs/>
+                <w:color w:val="000000"/>
+                <w:sz w:val="22"/>
+                <w:szCs w:val="22"/>
+                <w:lang w:val="pt-BR"/>
+              </w:rPr>
+            </w:pPr>
+            <w:r>
+              <w:rPr>
+                <w:rFonts w:ascii="Calibri" w:hAnsi="Calibri" w:cs="Calibri"/>
+                <w:b/>
+                <w:bCs/>
+                <w:color w:val="000000"/>
+                <w:sz w:val="22"/>
+                <w:szCs w:val="22"/>
+              </w:rPr>
+              <w:lastRenderedPageBreak/>
+              <w:t>EMITENTE / CEDENTE</w:t>
+            </w:r>
+          </w:p>
+        </w:tc>
+        <w:tc>
+          <w:tcPr>
+            <w:tcW w:w="3414" w:type="dxa"/>
+            <w:tcBorders>
+              <w:top w:val="single" w:sz="4" w:space="0" w:color="auto"/>
+              <w:left w:val="nil"/>
+              <w:bottom w:val="nil"/>
+              <w:right w:val="single" w:sz="4" w:space="0" w:color="auto"/>
+            </w:tcBorders>
+            <w:noWrap/>
+            <w:vAlign w:val="bottom"/>
+            <w:hideMark/>
+          </w:tcPr>
+          <w:p>
+            <w:pPr>
+              <w:rPr>
+                <w:rFonts w:ascii="Calibri" w:hAnsi="Calibri" w:cs="Calibri"/>
+                <w:b/>
+                <w:bCs/>
+                <w:color w:val="000000"/>
+                <w:sz w:val="22"/>
+                <w:szCs w:val="22"/>
+              </w:rPr>
+            </w:pPr>
+            <w:r>
+              <w:rPr>
+                <w:rFonts w:ascii="Calibri" w:hAnsi="Calibri" w:cs="Calibri"/>
+                <w:b/>
+                <w:bCs/>
+                <w:color w:val="000000"/>
+                <w:sz w:val="22"/>
+                <w:szCs w:val="22"/>
+              </w:rPr>
+              <w:t> </w:t>
+            </w:r>
+          </w:p>
+        </w:tc>
+      </w:tr>
+      <w:tr>
+        <w:trPr>
+          <w:trHeight w:val="369"/>
+        </w:trPr>
+        <w:tc>
+          <w:tcPr>
+            <w:tcW w:w="2095" w:type="dxa"/>
+            <w:tcBorders>
+              <w:top w:val="nil"/>
+              <w:left w:val="single" w:sz="4" w:space="0" w:color="auto"/>
+              <w:bottom w:val="nil"/>
+              <w:right w:val="nil"/>
+            </w:tcBorders>
+            <w:noWrap/>
+            <w:vAlign w:val="bottom"/>
+            <w:hideMark/>
+          </w:tcPr>
+          <w:p>
+            <w:pPr>
+              <w:jc w:val="center"/>
+              <w:rPr>
+                <w:rFonts w:ascii="Calibri" w:hAnsi="Calibri" w:cs="Calibri"/>
+                <w:b/>
+                <w:bCs/>
+                <w:color w:val="000000"/>
+                <w:sz w:val="22"/>
+                <w:szCs w:val="22"/>
+              </w:rPr>
+            </w:pPr>
+            <w:r>
+              <w:rPr>
+                <w:rFonts w:ascii="Calibri" w:hAnsi="Calibri" w:cs="Calibri"/>
+                <w:b/>
+                <w:bCs/>
+                <w:color w:val="000000"/>
+                <w:sz w:val="22"/>
+                <w:szCs w:val="22"/>
+              </w:rPr>
+              <w:t> </w:t>
+            </w:r>
+          </w:p>
+        </w:tc>
+        <w:tc>
+          <w:tcPr>
+            <w:tcW w:w="4042" w:type="dxa"/>
+            <w:tcBorders>
+              <w:top w:val="nil"/>
+              <w:left w:val="nil"/>
+              <w:bottom w:val="nil"/>
+              <w:right w:val="nil"/>
+            </w:tcBorders>
+            <w:noWrap/>
+            <w:vAlign w:val="bottom"/>
+            <w:hideMark/>
+          </w:tcPr>
+          <w:p>
+            <w:pPr>
+              <w:jc w:val="center"/>
+              <w:rPr>
+                <w:rFonts w:ascii="Calibri" w:hAnsi="Calibri" w:cs="Calibri"/>
+                <w:b/>
+                <w:bCs/>
+                <w:color w:val="000000"/>
+                <w:sz w:val="22"/>
+                <w:szCs w:val="22"/>
+              </w:rPr>
+            </w:pPr>
+          </w:p>
+        </w:tc>
+        <w:tc>
+          <w:tcPr>
+            <w:tcW w:w="3414" w:type="dxa"/>
+            <w:tcBorders>
+              <w:top w:val="nil"/>
+              <w:left w:val="nil"/>
+              <w:bottom w:val="nil"/>
+              <w:right w:val="single" w:sz="4" w:space="0" w:color="auto"/>
+            </w:tcBorders>
+            <w:noWrap/>
+            <w:vAlign w:val="bottom"/>
+            <w:hideMark/>
+          </w:tcPr>
+          <w:p>
+            <w:pPr>
+              <w:jc w:val="center"/>
+              <w:rPr>
+                <w:rFonts w:ascii="Calibri" w:hAnsi="Calibri" w:cs="Calibri"/>
+                <w:b/>
+                <w:bCs/>
+                <w:color w:val="000000"/>
+                <w:sz w:val="22"/>
+                <w:szCs w:val="22"/>
+              </w:rPr>
+            </w:pPr>
+            <w:r>
+              <w:rPr>
+                <w:rFonts w:ascii="Calibri" w:hAnsi="Calibri" w:cs="Calibri"/>
+                <w:b/>
+                <w:bCs/>
+                <w:color w:val="000000"/>
+                <w:sz w:val="22"/>
+                <w:szCs w:val="22"/>
+              </w:rPr>
+              <w:t> </w:t>
+            </w:r>
+          </w:p>
+        </w:tc>
+      </w:tr>
+      <w:tr>
+        <w:trPr>
+          <w:trHeight w:val="369"/>
+        </w:trPr>
+        <w:tc>
+          <w:tcPr>
+            <w:tcW w:w="9552" w:type="dxa"/>
+            <w:gridSpan w:val="3"/>
+            <w:tcBorders>
+              <w:top w:val="nil"/>
+              <w:left w:val="single" w:sz="4" w:space="0" w:color="auto"/>
+              <w:bottom w:val="nil"/>
+              <w:right w:val="single" w:sz="4" w:space="0" w:color="000000"/>
+            </w:tcBorders>
+            <w:noWrap/>
+            <w:vAlign w:val="bottom"/>
+            <w:hideMark/>
+          </w:tcPr>
+          <w:p>
+            <w:pPr>
+              <w:jc w:val="center"/>
+              <w:rPr>
+                <w:rFonts w:ascii="Calibri" w:hAnsi="Calibri" w:cs="Calibri"/>
+                <w:color w:val="000000"/>
+                <w:sz w:val="22"/>
+                <w:szCs w:val="22"/>
+              </w:rPr>
+            </w:pPr>
+            <w:r>
+              <w:rPr>
+                <w:rFonts w:ascii="Calibri" w:hAnsi="Calibri" w:cs="Calibri"/>
+                <w:color w:val="000000"/>
+                <w:sz w:val="22"/>
+                <w:szCs w:val="22"/>
+              </w:rPr>
+              <w:t>__________________________________________________________</w:t>
+            </w:r>
+          </w:p>
+        </w:tc>
+      </w:tr>
+      <w:tr>
+        <w:trPr>
+          <w:trHeight w:val="369"/>
+        </w:trPr>
+        <w:tc>
+          <w:tcPr>
+            <w:tcW w:w="9552" w:type="dxa"/>
+            <w:gridSpan w:val="3"/>
+            <w:tcBorders>
+              <w:top w:val="nil"/>
+              <w:left w:val="single" w:sz="4" w:space="0" w:color="auto"/>
+              <w:bottom w:val="nil"/>
+              <w:right w:val="single" w:sz="4" w:space="0" w:color="000000"/>
+            </w:tcBorders>
+            <w:noWrap/>
+            <w:vAlign w:val="bottom"/>
+            <w:hideMark/>
+          </w:tcPr>
+          <w:p>
+            <w:pPr>
+              <w:jc w:val="center"/>
+              <w:rPr>
+                <w:rFonts w:ascii="Calibri" w:hAnsi="Calibri" w:cs="Calibri"/>
+                <w:color w:val="000000"/>
+                <w:sz w:val="22"/>
+                <w:szCs w:val="22"/>
+              </w:rPr>
+            </w:pPr>
+            <w:r>
+              <w:rPr>
+                <w:rFonts w:ascii="Calibri" w:hAnsi="Calibri" w:cs="Calibri"/>
+                <w:color w:val="000000"/>
+                <w:sz w:val="22"/>
+                <w:szCs w:val="22"/>
+              </w:rPr>
+              <w:t>(</w:t>
+            </w:r>
+            <w:proofErr w:type="spellStart"/>
+            <w:r>
+              <w:rPr>
+                <w:rFonts w:ascii="Calibri" w:hAnsi="Calibri" w:cs="Calibri"/>
+                <w:color w:val="000000"/>
+                <w:sz w:val="22"/>
+                <w:szCs w:val="22"/>
+              </w:rPr>
+              <w:t>assinatura</w:t>
+            </w:r>
+            <w:proofErr w:type="spellEnd"/>
+            <w:r>
+              <w:rPr>
+                <w:rFonts w:ascii="Calibri" w:hAnsi="Calibri" w:cs="Calibri"/>
+                <w:color w:val="000000"/>
+                <w:sz w:val="22"/>
+                <w:szCs w:val="22"/>
+              </w:rPr>
+              <w:t>)</w:t>
+            </w:r>
+          </w:p>
+        </w:tc>
+      </w:tr>
+      <w:tr>
+        <w:trPr>
+          <w:trHeight w:val="369"/>
+        </w:trPr>
+        <w:tc>
+          <w:tcPr>
+            <w:tcW w:w="9552" w:type="dxa"/>
+            <w:gridSpan w:val="3"/>
+            <w:tcBorders>
+              <w:top w:val="nil"/>
+              <w:left w:val="single" w:sz="4" w:space="0" w:color="auto"/>
+              <w:bottom w:val="nil"/>
+              <w:right w:val="single" w:sz="4" w:space="0" w:color="000000"/>
+            </w:tcBorders>
+            <w:noWrap/>
+            <w:vAlign w:val="bottom"/>
+            <w:hideMark/>
+          </w:tcPr>
+          <w:p>
+            <w:pPr>
+              <w:jc w:val="center"/>
+              <w:rPr>
+                <w:rFonts w:ascii="Calibri" w:hAnsi="Calibri" w:cs="Calibri"/>
+                <w:color w:val="000000"/>
+                <w:sz w:val="22"/>
+                <w:szCs w:val="22"/>
+              </w:rPr>
+            </w:pPr>
+            <w:r>
+              <w:rPr>
+                <w:rFonts w:ascii="Calibri" w:hAnsi="Calibri" w:cs="Calibri"/>
+                <w:color w:val="000000"/>
+                <w:sz w:val="22"/>
+                <w:szCs w:val="22"/>
+              </w:rPr>
+              <w:t> </w:t>
+            </w:r>
+          </w:p>
+        </w:tc>
+      </w:tr>
+      <w:tr>
+        <w:trPr>
+          <w:trHeight w:val="369"/>
+        </w:trPr>
+        <w:tc>
+          <w:tcPr>
+            <w:tcW w:w="2095" w:type="dxa"/>
+            <w:tcBorders>
+              <w:top w:val="nil"/>
+              <w:left w:val="single" w:sz="4" w:space="0" w:color="auto"/>
+              <w:bottom w:val="nil"/>
+              <w:right w:val="nil"/>
+            </w:tcBorders>
+            <w:noWrap/>
+            <w:vAlign w:val="bottom"/>
+            <w:hideMark/>
+          </w:tcPr>
+          <w:p>
+            <w:pPr>
+              <w:rPr>
+                <w:rFonts w:ascii="Calibri" w:hAnsi="Calibri" w:cs="Calibri"/>
+                <w:color w:val="000000"/>
+                <w:sz w:val="22"/>
+                <w:szCs w:val="22"/>
+              </w:rPr>
+            </w:pPr>
+            <w:proofErr w:type="spellStart"/>
+            <w:r>
+              <w:rPr>
+                <w:rFonts w:ascii="Calibri" w:hAnsi="Calibri" w:cs="Calibri"/>
+                <w:color w:val="000000"/>
+                <w:sz w:val="22"/>
+                <w:szCs w:val="22"/>
+              </w:rPr>
+              <w:t>Razão</w:t>
+            </w:r>
+            <w:proofErr w:type="spellEnd"/>
+            <w:r>
+              <w:rPr>
+                <w:rFonts w:ascii="Calibri" w:hAnsi="Calibri" w:cs="Calibri"/>
+                <w:color w:val="000000"/>
+                <w:sz w:val="22"/>
+                <w:szCs w:val="22"/>
+              </w:rPr>
+              <w:t xml:space="preserve"> Social:</w:t>
+            </w:r>
+          </w:p>
+        </w:tc>
+        <w:tc>
+          <w:tcPr>
+            <w:tcW w:w="4042" w:type="dxa"/>
+            <w:tcBorders>
+              <w:top w:val="nil"/>
+              <w:left w:val="nil"/>
+              <w:bottom w:val="nil"/>
+              <w:right w:val="nil"/>
+            </w:tcBorders>
+            <w:vAlign w:val="center"/>
+            <w:hideMark/>
+          </w:tcPr>
+          <w:p>
+            <w:pPr>
+              <w:rPr>
+                <w:rFonts w:ascii="Calibri" w:hAnsi="Calibri" w:cs="Calibri"/>
+                <w:color w:val="000000"/>
+                <w:sz w:val="22"/>
+                <w:szCs w:val="22"/>
+              </w:rPr>
+            </w:pPr>
+            <w:proofErr w:type="gramStart"/>
+            <w:r>
+              <w:rPr>
+                <w:rFonts w:ascii="Calibri" w:hAnsi="Calibri" w:cs="Calibri"/>
+                <w:color w:val="000000"/>
+                <w:sz w:val="22"/>
+                <w:szCs w:val="22"/>
+              </w:rPr>
+              <w:t xml:space="preserve">{{ </w:t>
+            </w:r>
+            <w:proofErr w:type="spellStart"/>
+            <w:r>
+              <w:rPr>
+                <w:rFonts w:ascii="Calibri" w:hAnsi="Calibri" w:cs="Calibri"/>
+                <w:color w:val="000000"/>
+                <w:sz w:val="22"/>
+                <w:szCs w:val="22"/>
+              </w:rPr>
+              <w:t>emitente</w:t>
+            </w:r>
+            <w:proofErr w:type="gramEnd"/>
+            <w:r>
+              <w:rPr>
+                <w:rFonts w:ascii="Calibri" w:hAnsi="Calibri" w:cs="Calibri"/>
+                <w:color w:val="000000"/>
+                <w:sz w:val="22"/>
+                <w:szCs w:val="22"/>
+              </w:rPr>
+              <w:t>_razao_social</w:t>
+            </w:r>
+            <w:proofErr w:type="spellEnd"/>
+            <w:r>
+              <w:rPr>
+                <w:rFonts w:ascii="Calibri" w:hAnsi="Calibri" w:cs="Calibri"/>
+                <w:color w:val="000000"/>
+                <w:sz w:val="22"/>
+                <w:szCs w:val="22"/>
+              </w:rPr>
+              <w:t xml:space="preserve"> }}</w:t>
+            </w:r>
+          </w:p>
+        </w:tc>
+        <w:tc>
+          <w:tcPr>
+            <w:tcW w:w="3414" w:type="dxa"/>
+            <w:tcBorders>
+              <w:top w:val="nil"/>
+              <w:left w:val="nil"/>
+              <w:bottom w:val="nil"/>
+              <w:right w:val="single" w:sz="4" w:space="0" w:color="auto"/>
+            </w:tcBorders>
+            <w:noWrap/>
+            <w:vAlign w:val="bottom"/>
+            <w:hideMark/>
+          </w:tcPr>
+          <w:p>
+            <w:pPr>
+              <w:rPr>
+                <w:rFonts w:ascii="Calibri" w:hAnsi="Calibri" w:cs="Calibri"/>
+                <w:color w:val="000000"/>
+                <w:sz w:val="22"/>
+                <w:szCs w:val="22"/>
+              </w:rPr>
+            </w:pPr>
+            <w:r>
+              <w:rPr>
+                <w:rFonts w:ascii="Calibri" w:hAnsi="Calibri" w:cs="Calibri"/>
+                <w:color w:val="000000"/>
+                <w:sz w:val="22"/>
+                <w:szCs w:val="22"/>
+              </w:rPr>
+              <w:t> </w:t>
+            </w:r>
+          </w:p>
+        </w:tc>
+      </w:tr>
+      <w:tr>
+        <w:trPr>
+          <w:trHeight w:val="369"/>
+        </w:trPr>
+        <w:tc>
+          <w:tcPr>
+            <w:tcW w:w="2095" w:type="dxa"/>
+            <w:tcBorders>
+              <w:top w:val="nil"/>
+              <w:left w:val="single" w:sz="4" w:space="0" w:color="auto"/>
+              <w:bottom w:val="nil"/>
+              <w:right w:val="nil"/>
+            </w:tcBorders>
+            <w:noWrap/>
+            <w:vAlign w:val="bottom"/>
+            <w:hideMark/>
+          </w:tcPr>
+          <w:p>
+            <w:pPr>
+              <w:rPr>
+                <w:rFonts w:ascii="Calibri" w:hAnsi="Calibri" w:cs="Calibri"/>
+                <w:color w:val="000000"/>
+                <w:sz w:val="22"/>
+                <w:szCs w:val="22"/>
+              </w:rPr>
+            </w:pPr>
+            <w:r>
+              <w:rPr>
+                <w:rFonts w:ascii="Calibri" w:hAnsi="Calibri" w:cs="Calibri"/>
+                <w:color w:val="000000"/>
+                <w:sz w:val="22"/>
+                <w:szCs w:val="22"/>
+              </w:rPr>
+              <w:t>CNPJ/ME:</w:t>
+            </w:r>
+          </w:p>
+        </w:tc>
+        <w:tc>
+          <w:tcPr>
+            <w:tcW w:w="4042" w:type="dxa"/>
+            <w:tcBorders>
+              <w:top w:val="nil"/>
+              <w:left w:val="nil"/>
+              <w:bottom w:val="nil"/>
+              <w:right w:val="nil"/>
+            </w:tcBorders>
+            <w:vAlign w:val="center"/>
+            <w:hideMark/>
+          </w:tcPr>
+          <w:p>
+            <w:pPr>
+              <w:rPr>
+                <w:rFonts w:ascii="Calibri" w:hAnsi="Calibri" w:cs="Calibri"/>
+                <w:color w:val="000000"/>
+                <w:sz w:val="22"/>
+                <w:szCs w:val="22"/>
+              </w:rPr>
+            </w:pPr>
+            <w:proofErr w:type="gramStart"/>
+            <w:r>
+              <w:rPr>
+                <w:rFonts w:ascii="Calibri" w:hAnsi="Calibri" w:cs="Calibri"/>
+                <w:color w:val="000000"/>
+                <w:sz w:val="22"/>
+                <w:szCs w:val="22"/>
+              </w:rPr>
+              <w:t xml:space="preserve">{{ </w:t>
+            </w:r>
+            <w:proofErr w:type="spellStart"/>
+            <w:r>
+              <w:rPr>
+                <w:rFonts w:ascii="Calibri" w:hAnsi="Calibri" w:cs="Calibri"/>
+                <w:color w:val="000000"/>
+                <w:sz w:val="22"/>
+                <w:szCs w:val="22"/>
+              </w:rPr>
+              <w:t>emitente</w:t>
+            </w:r>
+            <w:proofErr w:type="gramEnd"/>
+            <w:r>
+              <w:rPr>
+                <w:rFonts w:ascii="Calibri" w:hAnsi="Calibri" w:cs="Calibri"/>
+                <w:color w:val="000000"/>
+                <w:sz w:val="22"/>
+                <w:szCs w:val="22"/>
+              </w:rPr>
+              <w:t>_cnpj</w:t>
+            </w:r>
+            <w:proofErr w:type="spellEnd"/>
+            <w:r>
+              <w:rPr>
+                <w:rFonts w:ascii="Calibri" w:hAnsi="Calibri" w:cs="Calibri"/>
+                <w:color w:val="000000"/>
+                <w:sz w:val="22"/>
+                <w:szCs w:val="22"/>
+              </w:rPr>
+              <w:t xml:space="preserve"> }}</w:t>
+            </w:r>
+          </w:p>
+        </w:tc>
+        <w:tc>
+          <w:tcPr>
+            <w:tcW w:w="3414" w:type="dxa"/>
+            <w:tcBorders>
+              <w:top w:val="nil"/>
+              <w:left w:val="nil"/>
+              <w:bottom w:val="nil"/>
+              <w:right w:val="single" w:sz="4" w:space="0" w:color="auto"/>
+            </w:tcBorders>
+            <w:noWrap/>
+            <w:vAlign w:val="bottom"/>
+            <w:hideMark/>
+          </w:tcPr>
+          <w:p>
+            <w:pPr>
+              <w:rPr>
+                <w:rFonts w:ascii="Calibri" w:hAnsi="Calibri" w:cs="Calibri"/>
+                <w:color w:val="000000"/>
+                <w:sz w:val="22"/>
+                <w:szCs w:val="22"/>
+              </w:rPr>
+            </w:pPr>
+            <w:r>
+              <w:rPr>
+                <w:rFonts w:ascii="Calibri" w:hAnsi="Calibri" w:cs="Calibri"/>
+                <w:color w:val="000000"/>
+                <w:sz w:val="22"/>
+                <w:szCs w:val="22"/>
+              </w:rPr>
+              <w:t> </w:t>
+            </w:r>
+          </w:p>
+        </w:tc>
+      </w:tr>
+      <w:tr>
+        <w:trPr>
+          <w:trHeight w:val="369"/>
+        </w:trPr>
+        <w:tc>
+          <w:tcPr>
+            <w:tcW w:w="2095" w:type="dxa"/>
+            <w:tcBorders>
+              <w:top w:val="nil"/>
+              <w:left w:val="single" w:sz="4" w:space="0" w:color="auto"/>
+              <w:bottom w:val="nil"/>
+              <w:right w:val="nil"/>
+            </w:tcBorders>
+            <w:noWrap/>
+            <w:vAlign w:val="bottom"/>
+            <w:hideMark/>
+          </w:tcPr>
+          <w:p>
+            <w:pPr>
+              <w:rPr>
+                <w:rFonts w:ascii="Calibri" w:hAnsi="Calibri" w:cs="Calibri"/>
+                <w:color w:val="000000"/>
+                <w:sz w:val="22"/>
+                <w:szCs w:val="22"/>
+              </w:rPr>
+            </w:pPr>
+            <w:proofErr w:type="spellStart"/>
+            <w:r>
+              <w:rPr>
+                <w:rFonts w:ascii="Calibri" w:hAnsi="Calibri" w:cs="Calibri"/>
+                <w:color w:val="000000"/>
+                <w:sz w:val="22"/>
+                <w:szCs w:val="22"/>
+              </w:rPr>
+              <w:t>Representante</w:t>
+            </w:r>
+            <w:proofErr w:type="spellEnd"/>
+            <w:r>
+              <w:rPr>
+                <w:rFonts w:ascii="Calibri" w:hAnsi="Calibri" w:cs="Calibri"/>
+                <w:color w:val="000000"/>
+                <w:sz w:val="22"/>
+                <w:szCs w:val="22"/>
+              </w:rPr>
+              <w:t>:</w:t>
+            </w:r>
+          </w:p>
+        </w:tc>
+        <w:tc>
+          <w:tcPr>
+            <w:tcW w:w="4042" w:type="dxa"/>
+            <w:tcBorders>
+              <w:top w:val="nil"/>
+              <w:left w:val="nil"/>
+              <w:bottom w:val="nil"/>
+              <w:right w:val="nil"/>
+            </w:tcBorders>
+            <w:noWrap/>
+            <w:vAlign w:val="bottom"/>
+            <w:hideMark/>
+          </w:tcPr>
+          <w:p>
+            <w:pPr>
+              <w:rPr>
+                <w:rFonts w:ascii="Calibri" w:hAnsi="Calibri" w:cs="Calibri"/>
+                <w:color w:val="000000"/>
+                <w:sz w:val="22"/>
+                <w:szCs w:val="22"/>
+              </w:rPr>
+            </w:pPr>
+            <w:proofErr w:type="gramStart"/>
+            <w:r>
+              <w:rPr>
+                <w:rFonts w:ascii="Calibri" w:hAnsi="Calibri" w:cs="Calibri"/>
+                <w:color w:val="000000"/>
+                <w:sz w:val="22"/>
+                <w:szCs w:val="22"/>
+              </w:rPr>
+              <w:t xml:space="preserve">{{ </w:t>
+            </w:r>
+            <w:proofErr w:type="spellStart"/>
+            <w:r>
+              <w:rPr>
+                <w:rFonts w:ascii="Calibri" w:hAnsi="Calibri" w:cs="Calibri"/>
+                <w:color w:val="000000"/>
+                <w:sz w:val="22"/>
+                <w:szCs w:val="22"/>
+              </w:rPr>
+              <w:t>emitente</w:t>
+            </w:r>
+            <w:proofErr w:type="gramEnd"/>
+            <w:r>
+              <w:rPr>
+                <w:rFonts w:ascii="Calibri" w:hAnsi="Calibri" w:cs="Calibri"/>
+                <w:color w:val="000000"/>
+                <w:sz w:val="22"/>
+                <w:szCs w:val="22"/>
+              </w:rPr>
+              <w:t>_representante</w:t>
+            </w:r>
+            <w:proofErr w:type="spellEnd"/>
+            <w:r>
+              <w:rPr>
+                <w:rFonts w:ascii="Calibri" w:hAnsi="Calibri" w:cs="Calibri"/>
+                <w:color w:val="000000"/>
+                <w:sz w:val="22"/>
+                <w:szCs w:val="22"/>
+              </w:rPr>
+              <w:t xml:space="preserve"> }}</w:t>
+            </w:r>
+          </w:p>
+        </w:tc>
+        <w:tc>
+          <w:tcPr>
+            <w:tcW w:w="3414" w:type="dxa"/>
+            <w:tcBorders>
+              <w:top w:val="nil"/>
+              <w:left w:val="nil"/>
+              <w:bottom w:val="nil"/>
+              <w:right w:val="single" w:sz="4" w:space="0" w:color="auto"/>
+            </w:tcBorders>
+            <w:noWrap/>
+            <w:vAlign w:val="bottom"/>
+            <w:hideMark/>
+          </w:tcPr>
+          <w:p>
+            <w:pPr>
+              <w:rPr>
+                <w:rFonts w:ascii="Calibri" w:hAnsi="Calibri" w:cs="Calibri"/>
+                <w:color w:val="000000"/>
+                <w:sz w:val="22"/>
+                <w:szCs w:val="22"/>
+              </w:rPr>
+            </w:pPr>
+            <w:r>
+              <w:rPr>
+                <w:rFonts w:ascii="Calibri" w:hAnsi="Calibri" w:cs="Calibri"/>
+                <w:color w:val="000000"/>
+                <w:sz w:val="22"/>
+                <w:szCs w:val="22"/>
+              </w:rPr>
+              <w:t xml:space="preserve">E-mail: </w:t>
+            </w:r>
+            <w:proofErr w:type="gramStart"/>
+            <w:r>
+              <w:rPr>
+                <w:rFonts w:ascii="Calibri" w:hAnsi="Calibri" w:cs="Calibri"/>
+                <w:color w:val="000000"/>
+                <w:sz w:val="22"/>
+                <w:szCs w:val="22"/>
+              </w:rPr>
+              <w:t xml:space="preserve">{{ </w:t>
+            </w:r>
+            <w:proofErr w:type="spellStart"/>
+            <w:r>
+              <w:rPr>
+                <w:rFonts w:ascii="Calibri" w:hAnsi="Calibri" w:cs="Calibri"/>
+                <w:color w:val="000000"/>
+                <w:sz w:val="22"/>
+                <w:szCs w:val="22"/>
+              </w:rPr>
+              <w:t>emitente</w:t>
+            </w:r>
+            <w:proofErr w:type="gramEnd"/>
+            <w:r>
+              <w:rPr>
+                <w:rFonts w:ascii="Calibri" w:hAnsi="Calibri" w:cs="Calibri"/>
+                <w:color w:val="000000"/>
+                <w:sz w:val="22"/>
+                <w:szCs w:val="22"/>
+              </w:rPr>
+              <w:t>_email</w:t>
+            </w:r>
+            <w:proofErr w:type="spellEnd"/>
+            <w:r>
+              <w:rPr>
+                <w:rFonts w:ascii="Calibri" w:hAnsi="Calibri" w:cs="Calibri"/>
+                <w:color w:val="000000"/>
+                <w:sz w:val="22"/>
+                <w:szCs w:val="22"/>
+              </w:rPr>
+              <w:t xml:space="preserve"> }}</w:t>
+            </w:r>
+          </w:p>
+        </w:tc>
+      </w:tr>
+      <w:tr>
+        <w:trPr>
+          <w:trHeight w:val="369"/>
+        </w:trPr>
+        <w:tc>
+          <w:tcPr>
+            <w:tcW w:w="2095" w:type="dxa"/>
+            <w:tcBorders>
+              <w:top w:val="nil"/>
+              <w:left w:val="single" w:sz="4" w:space="0" w:color="auto"/>
+              <w:bottom w:val="nil"/>
+              <w:right w:val="nil"/>
+            </w:tcBorders>
+            <w:noWrap/>
+            <w:vAlign w:val="bottom"/>
+            <w:hideMark/>
+          </w:tcPr>
+          <w:p>
+            <w:pPr>
+              <w:rPr>
+                <w:rFonts w:ascii="Calibri" w:hAnsi="Calibri" w:cs="Calibri"/>
+                <w:color w:val="000000"/>
+                <w:sz w:val="22"/>
+                <w:szCs w:val="22"/>
+              </w:rPr>
+            </w:pPr>
+            <w:r>
+              <w:rPr>
+                <w:rFonts w:ascii="Calibri" w:hAnsi="Calibri" w:cs="Calibri"/>
+                <w:color w:val="000000"/>
+                <w:sz w:val="22"/>
+                <w:szCs w:val="22"/>
+              </w:rPr>
+              <w:t>CPF/ME:</w:t>
+            </w:r>
+          </w:p>
+        </w:tc>
+        <w:tc>
+          <w:tcPr>
+            <w:tcW w:w="4042" w:type="dxa"/>
+            <w:tcBorders>
+              <w:top w:val="nil"/>
+              <w:left w:val="nil"/>
+              <w:bottom w:val="nil"/>
+              <w:right w:val="nil"/>
+            </w:tcBorders>
+            <w:noWrap/>
+            <w:vAlign w:val="bottom"/>
+            <w:hideMark/>
+          </w:tcPr>
+          <w:p>
+            <w:pPr>
+              <w:rPr>
+                <w:rFonts w:ascii="Calibri" w:hAnsi="Calibri" w:cs="Calibri"/>
+                <w:color w:val="000000"/>
+                <w:sz w:val="22"/>
+                <w:szCs w:val="22"/>
+              </w:rPr>
+            </w:pPr>
+            <w:proofErr w:type="gramStart"/>
+            <w:r>
+              <w:rPr>
+                <w:rFonts w:ascii="Calibri" w:hAnsi="Calibri" w:cs="Calibri"/>
+                <w:color w:val="000000"/>
+                <w:sz w:val="22"/>
+                <w:szCs w:val="22"/>
+              </w:rPr>
+              <w:t xml:space="preserve">{{ </w:t>
+            </w:r>
+            <w:proofErr w:type="spellStart"/>
+            <w:r>
+              <w:rPr>
+                <w:rFonts w:ascii="Calibri" w:hAnsi="Calibri" w:cs="Calibri"/>
+                <w:color w:val="000000"/>
+                <w:sz w:val="22"/>
+                <w:szCs w:val="22"/>
+              </w:rPr>
+              <w:t>emitente</w:t>
+            </w:r>
+            <w:proofErr w:type="gramEnd"/>
+            <w:r>
+              <w:rPr>
+                <w:rFonts w:ascii="Calibri" w:hAnsi="Calibri" w:cs="Calibri"/>
+                <w:color w:val="000000"/>
+                <w:sz w:val="22"/>
+                <w:szCs w:val="22"/>
+              </w:rPr>
+              <w:t>_cpf</w:t>
+            </w:r>
+            <w:proofErr w:type="spellEnd"/>
+            <w:r>
+              <w:rPr>
+                <w:rFonts w:ascii="Calibri" w:hAnsi="Calibri" w:cs="Calibri"/>
+                <w:color w:val="000000"/>
+                <w:sz w:val="22"/>
+                <w:szCs w:val="22"/>
+              </w:rPr>
+              <w:t xml:space="preserve"> }}</w:t>
+            </w:r>
+          </w:p>
+        </w:tc>
+        <w:tc>
+          <w:tcPr>
+            <w:tcW w:w="3414" w:type="dxa"/>
+            <w:tcBorders>
+              <w:top w:val="nil"/>
+              <w:left w:val="nil"/>
+              <w:bottom w:val="nil"/>
+              <w:right w:val="single" w:sz="4" w:space="0" w:color="auto"/>
+            </w:tcBorders>
+            <w:noWrap/>
+            <w:vAlign w:val="bottom"/>
+            <w:hideMark/>
+          </w:tcPr>
+          <w:p>
+            <w:pPr>
+              <w:rPr>
+                <w:rFonts w:ascii="Calibri" w:hAnsi="Calibri" w:cs="Calibri"/>
+                <w:color w:val="000000"/>
+                <w:sz w:val="22"/>
+                <w:szCs w:val="22"/>
+              </w:rPr>
+            </w:pPr>
+            <w:r>
+              <w:rPr>
+                <w:rFonts w:ascii="Calibri" w:hAnsi="Calibri" w:cs="Calibri"/>
+                <w:color w:val="000000"/>
+                <w:sz w:val="22"/>
+                <w:szCs w:val="22"/>
+              </w:rPr>
+              <w:t>Cargo:</w:t>
+            </w:r>
+            <w:r>
+              <w:t xml:space="preserve"> </w:t>
+            </w:r>
+            <w:proofErr w:type="gramStart"/>
+            <w:r>
+              <w:rPr>
+                <w:rFonts w:ascii="Calibri" w:hAnsi="Calibri" w:cs="Calibri"/>
+                <w:color w:val="000000"/>
+                <w:sz w:val="22"/>
+                <w:szCs w:val="22"/>
+              </w:rPr>
+              <w:t xml:space="preserve">{{ </w:t>
+            </w:r>
+            <w:proofErr w:type="spellStart"/>
+            <w:r>
+              <w:rPr>
+                <w:rFonts w:ascii="Calibri" w:hAnsi="Calibri" w:cs="Calibri"/>
+                <w:color w:val="000000"/>
+                <w:sz w:val="22"/>
+                <w:szCs w:val="22"/>
+              </w:rPr>
+              <w:t>emitente</w:t>
+            </w:r>
+            <w:proofErr w:type="gramEnd"/>
+            <w:r>
+              <w:rPr>
+                <w:rFonts w:ascii="Calibri" w:hAnsi="Calibri" w:cs="Calibri"/>
+                <w:color w:val="000000"/>
+                <w:sz w:val="22"/>
+                <w:szCs w:val="22"/>
+              </w:rPr>
+              <w:t>_cargo</w:t>
+            </w:r>
+            <w:proofErr w:type="spellEnd"/>
+            <w:r>
+              <w:rPr>
+                <w:rFonts w:ascii="Calibri" w:hAnsi="Calibri" w:cs="Calibri"/>
+                <w:color w:val="000000"/>
+                <w:sz w:val="22"/>
+                <w:szCs w:val="22"/>
+              </w:rPr>
+              <w:t xml:space="preserve"> }}</w:t>
+            </w:r>
+          </w:p>
+        </w:tc>
+      </w:tr>
+      <w:tr>
+        <w:trPr>
+          <w:trHeight w:val="369"/>
+        </w:trPr>
+        <w:tc>
+          <w:tcPr>
+            <w:tcW w:w="2095" w:type="dxa"/>
+            <w:tcBorders>
+              <w:top w:val="nil"/>
+              <w:left w:val="single" w:sz="4" w:space="0" w:color="auto"/>
+              <w:bottom w:val="single" w:sz="4" w:space="0" w:color="auto"/>
+              <w:right w:val="nil"/>
+            </w:tcBorders>
+            <w:noWrap/>
+            <w:vAlign w:val="bottom"/>
+            <w:hideMark/>
+          </w:tcPr>
+          <w:p>
+            <w:pPr>
+              <w:rPr>
+                <w:rFonts w:ascii="Calibri" w:hAnsi="Calibri" w:cs="Calibri"/>
+                <w:color w:val="000000"/>
+                <w:sz w:val="22"/>
+                <w:szCs w:val="22"/>
+              </w:rPr>
+            </w:pPr>
+            <w:r>
+              <w:rPr>
+                <w:rFonts w:ascii="Calibri" w:hAnsi="Calibri" w:cs="Calibri"/>
+                <w:color w:val="000000"/>
+                <w:sz w:val="22"/>
+                <w:szCs w:val="22"/>
+              </w:rPr>
+              <w:t xml:space="preserve">End:  </w:t>
+            </w:r>
+          </w:p>
+        </w:tc>
+        <w:tc>
+          <w:tcPr>
+            <w:tcW w:w="4042" w:type="dxa"/>
+            <w:tcBorders>
+              <w:top w:val="nil"/>
+              <w:left w:val="nil"/>
+              <w:bottom w:val="single" w:sz="4" w:space="0" w:color="auto"/>
+              <w:right w:val="nil"/>
+            </w:tcBorders>
+            <w:noWrap/>
+            <w:vAlign w:val="bottom"/>
+            <w:hideMark/>
+          </w:tcPr>
+          <w:p>
+            <w:pPr>
+              <w:rPr>
+                <w:rFonts w:ascii="Calibri" w:hAnsi="Calibri" w:cs="Calibri"/>
+                <w:color w:val="000000"/>
+                <w:sz w:val="22"/>
+                <w:szCs w:val="22"/>
+              </w:rPr>
+            </w:pPr>
+            <w:proofErr w:type="gramStart"/>
+            <w:r>
+              <w:rPr>
+                <w:rFonts w:ascii="Calibri" w:hAnsi="Calibri" w:cs="Calibri"/>
+                <w:color w:val="000000"/>
+                <w:sz w:val="22"/>
+                <w:szCs w:val="22"/>
+              </w:rPr>
+              <w:t xml:space="preserve">{{ </w:t>
+            </w:r>
+            <w:proofErr w:type="spellStart"/>
+            <w:r>
+              <w:rPr>
+                <w:rFonts w:ascii="Calibri" w:hAnsi="Calibri" w:cs="Calibri"/>
+                <w:color w:val="000000"/>
+                <w:sz w:val="22"/>
+                <w:szCs w:val="22"/>
+              </w:rPr>
+              <w:t>emitente</w:t>
+            </w:r>
+            <w:proofErr w:type="gramEnd"/>
+            <w:r>
+              <w:rPr>
+                <w:rFonts w:ascii="Calibri" w:hAnsi="Calibri" w:cs="Calibri"/>
+                <w:color w:val="000000"/>
+                <w:sz w:val="22"/>
+                <w:szCs w:val="22"/>
+              </w:rPr>
+              <w:t>_endereco</w:t>
+            </w:r>
+            <w:proofErr w:type="spellEnd"/>
+            <w:r>
+              <w:rPr>
+                <w:rFonts w:ascii="Calibri" w:hAnsi="Calibri" w:cs="Calibri"/>
+                <w:color w:val="000000"/>
+                <w:sz w:val="22"/>
+                <w:szCs w:val="22"/>
+              </w:rPr>
+              <w:t xml:space="preserve"> }}</w:t>
+            </w:r>
+          </w:p>
+        </w:tc>
+        <w:tc>
+          <w:tcPr>
+            <w:tcW w:w="3414" w:type="dxa"/>
+            <w:tcBorders>
+              <w:top w:val="nil"/>
+              <w:left w:val="nil"/>
+              <w:bottom w:val="single" w:sz="4" w:space="0" w:color="auto"/>
+              <w:right w:val="single" w:sz="4" w:space="0" w:color="auto"/>
+            </w:tcBorders>
+            <w:noWrap/>
+            <w:vAlign w:val="bottom"/>
+            <w:hideMark/>
+          </w:tcPr>
+          <w:p>
+            <w:pPr>
+              <w:rPr>
+                <w:rFonts w:ascii="Calibri" w:hAnsi="Calibri" w:cs="Calibri"/>
+                <w:color w:val="000000"/>
+                <w:sz w:val="22"/>
+                <w:szCs w:val="22"/>
+              </w:rPr>
+            </w:pPr>
+            <w:r>
+              <w:rPr>
+                <w:rFonts w:ascii="Calibri" w:hAnsi="Calibri" w:cs="Calibri"/>
+                <w:color w:val="000000"/>
+                <w:sz w:val="22"/>
+                <w:szCs w:val="22"/>
+              </w:rPr>
+              <w:t> </w:t>
+            </w:r>
+          </w:p>
+        </w:tc>
+      </w:tr>
+    </w:tbl>
     <w:p>
       <w:pPr>
         <w:rPr>
@@ -3957,21 +5866,1093 @@
         </w:rPr>
       </w:pPr>
     </w:p>
-    <w:p>
-      <w:pPr>
-        <w:rPr>
-          <w:lang w:val="pt-BR"/>
-        </w:rPr>
-      </w:pPr>
-      <w:bookmarkStart w:id="13" w:name="Cessionario"/>
-      <w:r>
-        <w:rPr>
-          <w:lang w:val="pt-BR"/>
-        </w:rPr>
-        <w:t>[•]</w:t>
-      </w:r>
-      <w:bookmarkEnd w:id="13"/>
-    </w:p>
+    <w:tbl>
+      <w:tblPr>
+        <w:tblW w:w="9536" w:type="dxa"/>
+        <w:tblCellMar>
+          <w:left w:w="70" w:type="dxa"/>
+          <w:right w:w="70" w:type="dxa"/>
+        </w:tblCellMar>
+        <w:tblLook w:val="04A0" w:firstRow="1" w:lastRow="0" w:firstColumn="1" w:lastColumn="0" w:noHBand="0" w:noVBand="1"/>
+      </w:tblPr>
+      <w:tblGrid>
+        <w:gridCol w:w="2091"/>
+        <w:gridCol w:w="4037"/>
+        <w:gridCol w:w="3408"/>
+      </w:tblGrid>
+      <w:tr>
+        <w:trPr>
+          <w:trHeight w:val="375"/>
+        </w:trPr>
+        <w:tc>
+          <w:tcPr>
+            <w:tcW w:w="6128" w:type="dxa"/>
+            <w:gridSpan w:val="2"/>
+            <w:tcBorders>
+              <w:top w:val="single" w:sz="4" w:space="0" w:color="auto"/>
+              <w:left w:val="single" w:sz="4" w:space="0" w:color="auto"/>
+              <w:bottom w:val="nil"/>
+              <w:right w:val="nil"/>
+            </w:tcBorders>
+            <w:noWrap/>
+            <w:vAlign w:val="bottom"/>
+            <w:hideMark/>
+          </w:tcPr>
+          <w:p>
+            <w:pPr>
+              <w:rPr>
+                <w:rFonts w:ascii="Calibri" w:hAnsi="Calibri" w:cs="Calibri"/>
+                <w:b/>
+                <w:bCs/>
+                <w:color w:val="000000"/>
+                <w:sz w:val="22"/>
+                <w:szCs w:val="22"/>
+                <w:lang w:val="pt-BR"/>
+              </w:rPr>
+            </w:pPr>
+            <w:r>
+              <w:rPr>
+                <w:rFonts w:ascii="Calibri" w:hAnsi="Calibri" w:cs="Calibri"/>
+                <w:b/>
+                <w:bCs/>
+                <w:color w:val="000000"/>
+                <w:sz w:val="22"/>
+                <w:szCs w:val="22"/>
+              </w:rPr>
+              <w:t>CESSIONÁRIO / CREDOR</w:t>
+            </w:r>
+          </w:p>
+        </w:tc>
+        <w:tc>
+          <w:tcPr>
+            <w:tcW w:w="3408" w:type="dxa"/>
+            <w:tcBorders>
+              <w:top w:val="single" w:sz="4" w:space="0" w:color="auto"/>
+              <w:left w:val="nil"/>
+              <w:bottom w:val="nil"/>
+              <w:right w:val="single" w:sz="4" w:space="0" w:color="auto"/>
+            </w:tcBorders>
+            <w:noWrap/>
+            <w:vAlign w:val="bottom"/>
+            <w:hideMark/>
+          </w:tcPr>
+          <w:p>
+            <w:pPr>
+              <w:rPr>
+                <w:rFonts w:ascii="Calibri" w:hAnsi="Calibri" w:cs="Calibri"/>
+                <w:b/>
+                <w:bCs/>
+                <w:color w:val="000000"/>
+                <w:sz w:val="22"/>
+                <w:szCs w:val="22"/>
+              </w:rPr>
+            </w:pPr>
+            <w:r>
+              <w:rPr>
+                <w:rFonts w:ascii="Calibri" w:hAnsi="Calibri" w:cs="Calibri"/>
+                <w:b/>
+                <w:bCs/>
+                <w:color w:val="000000"/>
+                <w:sz w:val="22"/>
+                <w:szCs w:val="22"/>
+              </w:rPr>
+              <w:t> </w:t>
+            </w:r>
+          </w:p>
+        </w:tc>
+      </w:tr>
+      <w:tr>
+        <w:trPr>
+          <w:trHeight w:val="375"/>
+        </w:trPr>
+        <w:tc>
+          <w:tcPr>
+            <w:tcW w:w="2091" w:type="dxa"/>
+            <w:tcBorders>
+              <w:top w:val="nil"/>
+              <w:left w:val="single" w:sz="4" w:space="0" w:color="auto"/>
+              <w:bottom w:val="nil"/>
+              <w:right w:val="nil"/>
+            </w:tcBorders>
+            <w:noWrap/>
+            <w:vAlign w:val="bottom"/>
+            <w:hideMark/>
+          </w:tcPr>
+          <w:p>
+            <w:pPr>
+              <w:jc w:val="center"/>
+              <w:rPr>
+                <w:rFonts w:ascii="Calibri" w:hAnsi="Calibri" w:cs="Calibri"/>
+                <w:b/>
+                <w:bCs/>
+                <w:color w:val="000000"/>
+                <w:sz w:val="22"/>
+                <w:szCs w:val="22"/>
+              </w:rPr>
+            </w:pPr>
+            <w:r>
+              <w:rPr>
+                <w:rFonts w:ascii="Calibri" w:hAnsi="Calibri" w:cs="Calibri"/>
+                <w:b/>
+                <w:bCs/>
+                <w:color w:val="000000"/>
+                <w:sz w:val="22"/>
+                <w:szCs w:val="22"/>
+              </w:rPr>
+              <w:t> </w:t>
+            </w:r>
+          </w:p>
+        </w:tc>
+        <w:tc>
+          <w:tcPr>
+            <w:tcW w:w="4037" w:type="dxa"/>
+            <w:tcBorders>
+              <w:top w:val="nil"/>
+              <w:left w:val="nil"/>
+              <w:bottom w:val="nil"/>
+              <w:right w:val="nil"/>
+            </w:tcBorders>
+            <w:noWrap/>
+            <w:vAlign w:val="bottom"/>
+            <w:hideMark/>
+          </w:tcPr>
+          <w:p>
+            <w:pPr>
+              <w:jc w:val="center"/>
+              <w:rPr>
+                <w:rFonts w:ascii="Calibri" w:hAnsi="Calibri" w:cs="Calibri"/>
+                <w:b/>
+                <w:bCs/>
+                <w:color w:val="000000"/>
+                <w:sz w:val="22"/>
+                <w:szCs w:val="22"/>
+              </w:rPr>
+            </w:pPr>
+          </w:p>
+        </w:tc>
+        <w:tc>
+          <w:tcPr>
+            <w:tcW w:w="3408" w:type="dxa"/>
+            <w:tcBorders>
+              <w:top w:val="nil"/>
+              <w:left w:val="nil"/>
+              <w:bottom w:val="nil"/>
+              <w:right w:val="single" w:sz="4" w:space="0" w:color="auto"/>
+            </w:tcBorders>
+            <w:noWrap/>
+            <w:vAlign w:val="bottom"/>
+            <w:hideMark/>
+          </w:tcPr>
+          <w:p>
+            <w:pPr>
+              <w:jc w:val="center"/>
+              <w:rPr>
+                <w:rFonts w:ascii="Calibri" w:hAnsi="Calibri" w:cs="Calibri"/>
+                <w:b/>
+                <w:bCs/>
+                <w:color w:val="000000"/>
+                <w:sz w:val="22"/>
+                <w:szCs w:val="22"/>
+              </w:rPr>
+            </w:pPr>
+            <w:r>
+              <w:rPr>
+                <w:rFonts w:ascii="Calibri" w:hAnsi="Calibri" w:cs="Calibri"/>
+                <w:b/>
+                <w:bCs/>
+                <w:color w:val="000000"/>
+                <w:sz w:val="22"/>
+                <w:szCs w:val="22"/>
+              </w:rPr>
+              <w:t> </w:t>
+            </w:r>
+          </w:p>
+        </w:tc>
+      </w:tr>
+      <w:tr>
+        <w:trPr>
+          <w:trHeight w:val="375"/>
+        </w:trPr>
+        <w:tc>
+          <w:tcPr>
+            <w:tcW w:w="9536" w:type="dxa"/>
+            <w:gridSpan w:val="3"/>
+            <w:tcBorders>
+              <w:top w:val="nil"/>
+              <w:left w:val="single" w:sz="4" w:space="0" w:color="auto"/>
+              <w:bottom w:val="nil"/>
+              <w:right w:val="single" w:sz="4" w:space="0" w:color="000000"/>
+            </w:tcBorders>
+            <w:noWrap/>
+            <w:vAlign w:val="bottom"/>
+            <w:hideMark/>
+          </w:tcPr>
+          <w:p>
+            <w:pPr>
+              <w:jc w:val="center"/>
+              <w:rPr>
+                <w:rFonts w:ascii="Calibri" w:hAnsi="Calibri" w:cs="Calibri"/>
+                <w:color w:val="000000"/>
+                <w:sz w:val="22"/>
+                <w:szCs w:val="22"/>
+              </w:rPr>
+            </w:pPr>
+            <w:r>
+              <w:rPr>
+                <w:rFonts w:ascii="Calibri" w:hAnsi="Calibri" w:cs="Calibri"/>
+                <w:color w:val="000000"/>
+                <w:sz w:val="22"/>
+                <w:szCs w:val="22"/>
+              </w:rPr>
+              <w:t>__________________________________________________________</w:t>
+            </w:r>
+          </w:p>
+        </w:tc>
+      </w:tr>
+      <w:tr>
+        <w:trPr>
+          <w:trHeight w:val="375"/>
+        </w:trPr>
+        <w:tc>
+          <w:tcPr>
+            <w:tcW w:w="9536" w:type="dxa"/>
+            <w:gridSpan w:val="3"/>
+            <w:tcBorders>
+              <w:top w:val="nil"/>
+              <w:left w:val="single" w:sz="4" w:space="0" w:color="auto"/>
+              <w:bottom w:val="nil"/>
+              <w:right w:val="single" w:sz="4" w:space="0" w:color="000000"/>
+            </w:tcBorders>
+            <w:noWrap/>
+            <w:vAlign w:val="bottom"/>
+            <w:hideMark/>
+          </w:tcPr>
+          <w:p>
+            <w:pPr>
+              <w:jc w:val="center"/>
+              <w:rPr>
+                <w:rFonts w:ascii="Calibri" w:hAnsi="Calibri" w:cs="Calibri"/>
+                <w:color w:val="000000"/>
+                <w:sz w:val="22"/>
+                <w:szCs w:val="22"/>
+              </w:rPr>
+            </w:pPr>
+            <w:r>
+              <w:rPr>
+                <w:rFonts w:ascii="Calibri" w:hAnsi="Calibri" w:cs="Calibri"/>
+                <w:color w:val="000000"/>
+                <w:sz w:val="22"/>
+                <w:szCs w:val="22"/>
+              </w:rPr>
+              <w:t>(</w:t>
+            </w:r>
+            <w:proofErr w:type="spellStart"/>
+            <w:r>
+              <w:rPr>
+                <w:rFonts w:ascii="Calibri" w:hAnsi="Calibri" w:cs="Calibri"/>
+                <w:color w:val="000000"/>
+                <w:sz w:val="22"/>
+                <w:szCs w:val="22"/>
+              </w:rPr>
+              <w:t>assinatura</w:t>
+            </w:r>
+            <w:proofErr w:type="spellEnd"/>
+            <w:r>
+              <w:rPr>
+                <w:rFonts w:ascii="Calibri" w:hAnsi="Calibri" w:cs="Calibri"/>
+                <w:color w:val="000000"/>
+                <w:sz w:val="22"/>
+                <w:szCs w:val="22"/>
+              </w:rPr>
+              <w:t>)</w:t>
+            </w:r>
+          </w:p>
+        </w:tc>
+      </w:tr>
+      <w:tr>
+        <w:trPr>
+          <w:trHeight w:val="375"/>
+        </w:trPr>
+        <w:tc>
+          <w:tcPr>
+            <w:tcW w:w="9536" w:type="dxa"/>
+            <w:gridSpan w:val="3"/>
+            <w:tcBorders>
+              <w:top w:val="nil"/>
+              <w:left w:val="single" w:sz="4" w:space="0" w:color="auto"/>
+              <w:bottom w:val="nil"/>
+              <w:right w:val="single" w:sz="4" w:space="0" w:color="000000"/>
+            </w:tcBorders>
+            <w:noWrap/>
+            <w:vAlign w:val="bottom"/>
+            <w:hideMark/>
+          </w:tcPr>
+          <w:p>
+            <w:pPr>
+              <w:jc w:val="center"/>
+              <w:rPr>
+                <w:rFonts w:ascii="Calibri" w:hAnsi="Calibri" w:cs="Calibri"/>
+                <w:color w:val="000000"/>
+                <w:sz w:val="22"/>
+                <w:szCs w:val="22"/>
+              </w:rPr>
+            </w:pPr>
+            <w:r>
+              <w:rPr>
+                <w:rFonts w:ascii="Calibri" w:hAnsi="Calibri" w:cs="Calibri"/>
+                <w:color w:val="000000"/>
+                <w:sz w:val="22"/>
+                <w:szCs w:val="22"/>
+              </w:rPr>
+              <w:t> </w:t>
+            </w:r>
+          </w:p>
+        </w:tc>
+      </w:tr>
+      <w:tr>
+        <w:trPr>
+          <w:trHeight w:val="375"/>
+        </w:trPr>
+        <w:tc>
+          <w:tcPr>
+            <w:tcW w:w="2091" w:type="dxa"/>
+            <w:tcBorders>
+              <w:top w:val="nil"/>
+              <w:left w:val="single" w:sz="4" w:space="0" w:color="auto"/>
+              <w:bottom w:val="nil"/>
+              <w:right w:val="nil"/>
+            </w:tcBorders>
+            <w:noWrap/>
+            <w:vAlign w:val="center"/>
+            <w:hideMark/>
+          </w:tcPr>
+          <w:p>
+            <w:pPr>
+              <w:rPr>
+                <w:rFonts w:ascii="Calibri" w:hAnsi="Calibri" w:cs="Calibri"/>
+                <w:color w:val="000000"/>
+                <w:sz w:val="22"/>
+                <w:szCs w:val="22"/>
+              </w:rPr>
+            </w:pPr>
+            <w:proofErr w:type="spellStart"/>
+            <w:r>
+              <w:rPr>
+                <w:rFonts w:ascii="Calibri" w:hAnsi="Calibri" w:cs="Calibri"/>
+                <w:color w:val="000000"/>
+                <w:sz w:val="22"/>
+                <w:szCs w:val="22"/>
+              </w:rPr>
+              <w:t>Razão</w:t>
+            </w:r>
+            <w:proofErr w:type="spellEnd"/>
+            <w:r>
+              <w:rPr>
+                <w:rFonts w:ascii="Calibri" w:hAnsi="Calibri" w:cs="Calibri"/>
+                <w:color w:val="000000"/>
+                <w:sz w:val="22"/>
+                <w:szCs w:val="22"/>
+              </w:rPr>
+              <w:t xml:space="preserve"> Social:</w:t>
+            </w:r>
+          </w:p>
+        </w:tc>
+        <w:tc>
+          <w:tcPr>
+            <w:tcW w:w="7445" w:type="dxa"/>
+            <w:gridSpan w:val="2"/>
+            <w:tcBorders>
+              <w:top w:val="nil"/>
+              <w:left w:val="nil"/>
+              <w:bottom w:val="nil"/>
+              <w:right w:val="single" w:sz="4" w:space="0" w:color="000000"/>
+            </w:tcBorders>
+            <w:vAlign w:val="center"/>
+            <w:hideMark/>
+          </w:tcPr>
+          <w:p>
+            <w:pPr>
+              <w:rPr>
+                <w:rFonts w:ascii="Calibri" w:hAnsi="Calibri" w:cs="Calibri"/>
+                <w:color w:val="000000"/>
+                <w:sz w:val="22"/>
+                <w:szCs w:val="22"/>
+              </w:rPr>
+            </w:pPr>
+            <w:proofErr w:type="gramStart"/>
+            <w:r>
+              <w:rPr>
+                <w:rFonts w:ascii="Calibri" w:hAnsi="Calibri" w:cs="Calibri"/>
+                <w:color w:val="000000"/>
+                <w:sz w:val="22"/>
+                <w:szCs w:val="22"/>
+              </w:rPr>
+              <w:t xml:space="preserve">{{ </w:t>
+            </w:r>
+            <w:proofErr w:type="spellStart"/>
+            <w:r>
+              <w:rPr>
+                <w:rFonts w:ascii="Calibri" w:hAnsi="Calibri" w:cs="Calibri"/>
+                <w:color w:val="000000"/>
+                <w:sz w:val="22"/>
+                <w:szCs w:val="22"/>
+              </w:rPr>
+              <w:t>cessionario</w:t>
+            </w:r>
+            <w:proofErr w:type="gramEnd"/>
+            <w:r>
+              <w:rPr>
+                <w:rFonts w:ascii="Calibri" w:hAnsi="Calibri" w:cs="Calibri"/>
+                <w:color w:val="000000"/>
+                <w:sz w:val="22"/>
+                <w:szCs w:val="22"/>
+              </w:rPr>
+              <w:t>_razao_social</w:t>
+            </w:r>
+            <w:proofErr w:type="spellEnd"/>
+            <w:r>
+              <w:rPr>
+                <w:rFonts w:ascii="Calibri" w:hAnsi="Calibri" w:cs="Calibri"/>
+                <w:color w:val="000000"/>
+                <w:sz w:val="22"/>
+                <w:szCs w:val="22"/>
+              </w:rPr>
+              <w:t xml:space="preserve"> }}</w:t>
+            </w:r>
+          </w:p>
+        </w:tc>
+      </w:tr>
+      <w:tr>
+        <w:trPr>
+          <w:trHeight w:val="375"/>
+        </w:trPr>
+        <w:tc>
+          <w:tcPr>
+            <w:tcW w:w="2091" w:type="dxa"/>
+            <w:tcBorders>
+              <w:top w:val="nil"/>
+              <w:left w:val="single" w:sz="4" w:space="0" w:color="auto"/>
+              <w:bottom w:val="nil"/>
+              <w:right w:val="nil"/>
+            </w:tcBorders>
+            <w:noWrap/>
+            <w:vAlign w:val="bottom"/>
+            <w:hideMark/>
+          </w:tcPr>
+          <w:p>
+            <w:pPr>
+              <w:rPr>
+                <w:rFonts w:ascii="Calibri" w:hAnsi="Calibri" w:cs="Calibri"/>
+                <w:color w:val="000000"/>
+                <w:sz w:val="22"/>
+                <w:szCs w:val="22"/>
+              </w:rPr>
+            </w:pPr>
+            <w:r>
+              <w:rPr>
+                <w:rFonts w:ascii="Calibri" w:hAnsi="Calibri" w:cs="Calibri"/>
+                <w:color w:val="000000"/>
+                <w:sz w:val="22"/>
+                <w:szCs w:val="22"/>
+              </w:rPr>
+              <w:t>CNPJ/ME:</w:t>
+            </w:r>
+          </w:p>
+        </w:tc>
+        <w:tc>
+          <w:tcPr>
+            <w:tcW w:w="4037" w:type="dxa"/>
+            <w:tcBorders>
+              <w:top w:val="nil"/>
+              <w:left w:val="nil"/>
+              <w:bottom w:val="nil"/>
+              <w:right w:val="nil"/>
+            </w:tcBorders>
+            <w:vAlign w:val="center"/>
+            <w:hideMark/>
+          </w:tcPr>
+          <w:p>
+            <w:pPr>
+              <w:rPr>
+                <w:rFonts w:ascii="Calibri" w:hAnsi="Calibri" w:cs="Calibri"/>
+                <w:color w:val="000000"/>
+                <w:sz w:val="22"/>
+                <w:szCs w:val="22"/>
+              </w:rPr>
+            </w:pPr>
+            <w:proofErr w:type="gramStart"/>
+            <w:r>
+              <w:rPr>
+                <w:rFonts w:ascii="Calibri" w:hAnsi="Calibri" w:cs="Calibri"/>
+                <w:color w:val="000000"/>
+                <w:sz w:val="22"/>
+                <w:szCs w:val="22"/>
+              </w:rPr>
+              <w:t xml:space="preserve">{{ </w:t>
+            </w:r>
+            <w:proofErr w:type="spellStart"/>
+            <w:r>
+              <w:rPr>
+                <w:rFonts w:ascii="Calibri" w:hAnsi="Calibri" w:cs="Calibri"/>
+                <w:color w:val="000000"/>
+                <w:sz w:val="22"/>
+                <w:szCs w:val="22"/>
+              </w:rPr>
+              <w:t>cessionario</w:t>
+            </w:r>
+            <w:proofErr w:type="gramEnd"/>
+            <w:r>
+              <w:rPr>
+                <w:rFonts w:ascii="Calibri" w:hAnsi="Calibri" w:cs="Calibri"/>
+                <w:color w:val="000000"/>
+                <w:sz w:val="22"/>
+                <w:szCs w:val="22"/>
+              </w:rPr>
+              <w:t>_cnpj</w:t>
+            </w:r>
+            <w:proofErr w:type="spellEnd"/>
+            <w:r>
+              <w:rPr>
+                <w:rFonts w:ascii="Calibri" w:hAnsi="Calibri" w:cs="Calibri"/>
+                <w:color w:val="000000"/>
+                <w:sz w:val="22"/>
+                <w:szCs w:val="22"/>
+              </w:rPr>
+              <w:t xml:space="preserve"> }}</w:t>
+            </w:r>
+          </w:p>
+        </w:tc>
+        <w:tc>
+          <w:tcPr>
+            <w:tcW w:w="3408" w:type="dxa"/>
+            <w:tcBorders>
+              <w:top w:val="nil"/>
+              <w:left w:val="nil"/>
+              <w:bottom w:val="nil"/>
+              <w:right w:val="single" w:sz="4" w:space="0" w:color="auto"/>
+            </w:tcBorders>
+            <w:noWrap/>
+            <w:vAlign w:val="bottom"/>
+            <w:hideMark/>
+          </w:tcPr>
+          <w:p>
+            <w:pPr>
+              <w:rPr>
+                <w:rFonts w:ascii="Calibri" w:hAnsi="Calibri" w:cs="Calibri"/>
+                <w:color w:val="000000"/>
+                <w:sz w:val="22"/>
+                <w:szCs w:val="22"/>
+              </w:rPr>
+            </w:pPr>
+            <w:r>
+              <w:rPr>
+                <w:rFonts w:ascii="Calibri" w:hAnsi="Calibri" w:cs="Calibri"/>
+                <w:color w:val="000000"/>
+                <w:sz w:val="22"/>
+                <w:szCs w:val="22"/>
+              </w:rPr>
+              <w:t> </w:t>
+            </w:r>
+          </w:p>
+        </w:tc>
+      </w:tr>
+      <w:tr>
+        <w:trPr>
+          <w:trHeight w:val="375"/>
+        </w:trPr>
+        <w:tc>
+          <w:tcPr>
+            <w:tcW w:w="2091" w:type="dxa"/>
+            <w:tcBorders>
+              <w:top w:val="nil"/>
+              <w:left w:val="single" w:sz="4" w:space="0" w:color="auto"/>
+              <w:bottom w:val="nil"/>
+              <w:right w:val="nil"/>
+            </w:tcBorders>
+            <w:noWrap/>
+            <w:vAlign w:val="bottom"/>
+            <w:hideMark/>
+          </w:tcPr>
+          <w:p>
+            <w:pPr>
+              <w:rPr>
+                <w:rFonts w:ascii="Calibri" w:hAnsi="Calibri" w:cs="Calibri"/>
+                <w:color w:val="000000"/>
+                <w:sz w:val="22"/>
+                <w:szCs w:val="22"/>
+              </w:rPr>
+            </w:pPr>
+            <w:proofErr w:type="spellStart"/>
+            <w:r>
+              <w:rPr>
+                <w:rFonts w:ascii="Calibri" w:hAnsi="Calibri" w:cs="Calibri"/>
+                <w:color w:val="000000"/>
+                <w:sz w:val="22"/>
+                <w:szCs w:val="22"/>
+              </w:rPr>
+              <w:t>Representante</w:t>
+            </w:r>
+            <w:proofErr w:type="spellEnd"/>
+            <w:r>
+              <w:rPr>
+                <w:rFonts w:ascii="Calibri" w:hAnsi="Calibri" w:cs="Calibri"/>
+                <w:color w:val="000000"/>
+                <w:sz w:val="22"/>
+                <w:szCs w:val="22"/>
+              </w:rPr>
+              <w:t>:</w:t>
+            </w:r>
+          </w:p>
+        </w:tc>
+        <w:tc>
+          <w:tcPr>
+            <w:tcW w:w="4037" w:type="dxa"/>
+            <w:tcBorders>
+              <w:top w:val="nil"/>
+              <w:left w:val="nil"/>
+              <w:bottom w:val="nil"/>
+              <w:right w:val="nil"/>
+            </w:tcBorders>
+            <w:noWrap/>
+            <w:vAlign w:val="bottom"/>
+            <w:hideMark/>
+          </w:tcPr>
+          <w:p>
+            <w:pPr>
+              <w:rPr>
+                <w:rFonts w:ascii="Calibri" w:hAnsi="Calibri" w:cs="Calibri"/>
+                <w:color w:val="000000"/>
+                <w:sz w:val="22"/>
+                <w:szCs w:val="22"/>
+              </w:rPr>
+            </w:pPr>
+            <w:proofErr w:type="gramStart"/>
+            <w:r>
+              <w:rPr>
+                <w:rFonts w:ascii="Calibri" w:hAnsi="Calibri" w:cs="Calibri"/>
+                <w:color w:val="000000"/>
+                <w:sz w:val="22"/>
+                <w:szCs w:val="22"/>
+              </w:rPr>
+              <w:t xml:space="preserve">{{ </w:t>
+            </w:r>
+            <w:proofErr w:type="spellStart"/>
+            <w:r>
+              <w:rPr>
+                <w:rFonts w:ascii="Calibri" w:hAnsi="Calibri" w:cs="Calibri"/>
+                <w:color w:val="000000"/>
+                <w:sz w:val="22"/>
+                <w:szCs w:val="22"/>
+              </w:rPr>
+              <w:t>cessionario</w:t>
+            </w:r>
+            <w:proofErr w:type="gramEnd"/>
+            <w:r>
+              <w:rPr>
+                <w:rFonts w:ascii="Calibri" w:hAnsi="Calibri" w:cs="Calibri"/>
+                <w:color w:val="000000"/>
+                <w:sz w:val="22"/>
+                <w:szCs w:val="22"/>
+              </w:rPr>
+              <w:t>_representante</w:t>
+            </w:r>
+            <w:proofErr w:type="spellEnd"/>
+            <w:r>
+              <w:rPr>
+                <w:rFonts w:ascii="Calibri" w:hAnsi="Calibri" w:cs="Calibri"/>
+                <w:color w:val="000000"/>
+                <w:sz w:val="22"/>
+                <w:szCs w:val="22"/>
+              </w:rPr>
+              <w:t xml:space="preserve"> }}</w:t>
+            </w:r>
+          </w:p>
+        </w:tc>
+        <w:tc>
+          <w:tcPr>
+            <w:tcW w:w="3408" w:type="dxa"/>
+            <w:tcBorders>
+              <w:top w:val="nil"/>
+              <w:left w:val="nil"/>
+              <w:bottom w:val="nil"/>
+              <w:right w:val="single" w:sz="4" w:space="0" w:color="auto"/>
+            </w:tcBorders>
+            <w:noWrap/>
+            <w:vAlign w:val="bottom"/>
+            <w:hideMark/>
+          </w:tcPr>
+          <w:p>
+            <w:pPr>
+              <w:rPr>
+                <w:rFonts w:ascii="Calibri" w:hAnsi="Calibri" w:cs="Calibri"/>
+                <w:color w:val="000000"/>
+                <w:sz w:val="22"/>
+                <w:szCs w:val="22"/>
+              </w:rPr>
+            </w:pPr>
+            <w:r>
+              <w:rPr>
+                <w:rFonts w:ascii="Calibri" w:hAnsi="Calibri" w:cs="Calibri"/>
+                <w:color w:val="000000"/>
+                <w:sz w:val="22"/>
+                <w:szCs w:val="22"/>
+              </w:rPr>
+              <w:t xml:space="preserve">E-mail: </w:t>
+            </w:r>
+            <w:proofErr w:type="gramStart"/>
+            <w:r>
+              <w:rPr>
+                <w:rFonts w:ascii="Calibri" w:hAnsi="Calibri" w:cs="Calibri"/>
+                <w:color w:val="000000"/>
+                <w:sz w:val="22"/>
+                <w:szCs w:val="22"/>
+              </w:rPr>
+              <w:t xml:space="preserve">{{ </w:t>
+            </w:r>
+            <w:proofErr w:type="spellStart"/>
+            <w:r>
+              <w:rPr>
+                <w:rFonts w:ascii="Calibri" w:hAnsi="Calibri" w:cs="Calibri"/>
+                <w:color w:val="000000"/>
+                <w:sz w:val="22"/>
+                <w:szCs w:val="22"/>
+              </w:rPr>
+              <w:t>cessionario</w:t>
+            </w:r>
+            <w:proofErr w:type="gramEnd"/>
+            <w:r>
+              <w:rPr>
+                <w:rFonts w:ascii="Calibri" w:hAnsi="Calibri" w:cs="Calibri"/>
+                <w:color w:val="000000"/>
+                <w:sz w:val="22"/>
+                <w:szCs w:val="22"/>
+              </w:rPr>
+              <w:t>_email</w:t>
+            </w:r>
+            <w:proofErr w:type="spellEnd"/>
+            <w:r>
+              <w:rPr>
+                <w:rFonts w:ascii="Calibri" w:hAnsi="Calibri" w:cs="Calibri"/>
+                <w:color w:val="000000"/>
+                <w:sz w:val="22"/>
+                <w:szCs w:val="22"/>
+              </w:rPr>
+              <w:t xml:space="preserve"> }}</w:t>
+            </w:r>
+          </w:p>
+        </w:tc>
+      </w:tr>
+      <w:tr>
+        <w:trPr>
+          <w:trHeight w:val="375"/>
+        </w:trPr>
+        <w:tc>
+          <w:tcPr>
+            <w:tcW w:w="2091" w:type="dxa"/>
+            <w:tcBorders>
+              <w:top w:val="nil"/>
+              <w:left w:val="single" w:sz="4" w:space="0" w:color="auto"/>
+              <w:bottom w:val="nil"/>
+              <w:right w:val="nil"/>
+            </w:tcBorders>
+            <w:noWrap/>
+            <w:vAlign w:val="bottom"/>
+            <w:hideMark/>
+          </w:tcPr>
+          <w:p>
+            <w:pPr>
+              <w:rPr>
+                <w:rFonts w:ascii="Calibri" w:hAnsi="Calibri" w:cs="Calibri"/>
+                <w:color w:val="000000"/>
+                <w:sz w:val="22"/>
+                <w:szCs w:val="22"/>
+              </w:rPr>
+            </w:pPr>
+            <w:r>
+              <w:rPr>
+                <w:rFonts w:ascii="Calibri" w:hAnsi="Calibri" w:cs="Calibri"/>
+                <w:color w:val="000000"/>
+                <w:sz w:val="22"/>
+                <w:szCs w:val="22"/>
+              </w:rPr>
+              <w:t>CPF/ME:</w:t>
+            </w:r>
+          </w:p>
+        </w:tc>
+        <w:tc>
+          <w:tcPr>
+            <w:tcW w:w="4037" w:type="dxa"/>
+            <w:tcBorders>
+              <w:top w:val="nil"/>
+              <w:left w:val="nil"/>
+              <w:bottom w:val="nil"/>
+              <w:right w:val="nil"/>
+            </w:tcBorders>
+            <w:noWrap/>
+            <w:vAlign w:val="bottom"/>
+            <w:hideMark/>
+          </w:tcPr>
+          <w:p>
+            <w:pPr>
+              <w:rPr>
+                <w:rFonts w:ascii="Calibri" w:hAnsi="Calibri" w:cs="Calibri"/>
+                <w:color w:val="000000"/>
+                <w:sz w:val="22"/>
+                <w:szCs w:val="22"/>
+              </w:rPr>
+            </w:pPr>
+            <w:proofErr w:type="gramStart"/>
+            <w:r>
+              <w:rPr>
+                <w:rFonts w:ascii="Calibri" w:hAnsi="Calibri" w:cs="Calibri"/>
+                <w:color w:val="000000"/>
+                <w:sz w:val="22"/>
+                <w:szCs w:val="22"/>
+              </w:rPr>
+              <w:t xml:space="preserve">{{ </w:t>
+            </w:r>
+            <w:proofErr w:type="spellStart"/>
+            <w:r>
+              <w:rPr>
+                <w:rFonts w:ascii="Calibri" w:hAnsi="Calibri" w:cs="Calibri"/>
+                <w:color w:val="000000"/>
+                <w:sz w:val="22"/>
+                <w:szCs w:val="22"/>
+              </w:rPr>
+              <w:t>cessionario</w:t>
+            </w:r>
+            <w:proofErr w:type="gramEnd"/>
+            <w:r>
+              <w:rPr>
+                <w:rFonts w:ascii="Calibri" w:hAnsi="Calibri" w:cs="Calibri"/>
+                <w:color w:val="000000"/>
+                <w:sz w:val="22"/>
+                <w:szCs w:val="22"/>
+              </w:rPr>
+              <w:t>_cpf</w:t>
+            </w:r>
+            <w:proofErr w:type="spellEnd"/>
+            <w:r>
+              <w:rPr>
+                <w:rFonts w:ascii="Calibri" w:hAnsi="Calibri" w:cs="Calibri"/>
+                <w:color w:val="000000"/>
+                <w:sz w:val="22"/>
+                <w:szCs w:val="22"/>
+              </w:rPr>
+              <w:t xml:space="preserve"> }}</w:t>
+            </w:r>
+          </w:p>
+        </w:tc>
+        <w:tc>
+          <w:tcPr>
+            <w:tcW w:w="3408" w:type="dxa"/>
+            <w:tcBorders>
+              <w:top w:val="nil"/>
+              <w:left w:val="nil"/>
+              <w:bottom w:val="nil"/>
+              <w:right w:val="single" w:sz="4" w:space="0" w:color="auto"/>
+            </w:tcBorders>
+            <w:noWrap/>
+            <w:vAlign w:val="bottom"/>
+            <w:hideMark/>
+          </w:tcPr>
+          <w:p>
+            <w:pPr>
+              <w:rPr>
+                <w:rFonts w:ascii="Calibri" w:hAnsi="Calibri" w:cs="Calibri"/>
+                <w:color w:val="000000"/>
+                <w:sz w:val="22"/>
+                <w:szCs w:val="22"/>
+              </w:rPr>
+            </w:pPr>
+            <w:r>
+              <w:rPr>
+                <w:rFonts w:ascii="Calibri" w:hAnsi="Calibri" w:cs="Calibri"/>
+                <w:color w:val="000000"/>
+                <w:sz w:val="22"/>
+                <w:szCs w:val="22"/>
+              </w:rPr>
+              <w:t xml:space="preserve">Cargo: </w:t>
+            </w:r>
+            <w:proofErr w:type="gramStart"/>
+            <w:r>
+              <w:rPr>
+                <w:rFonts w:ascii="Calibri" w:hAnsi="Calibri" w:cs="Calibri"/>
+                <w:color w:val="000000"/>
+                <w:sz w:val="22"/>
+                <w:szCs w:val="22"/>
+              </w:rPr>
+              <w:t xml:space="preserve">{{ </w:t>
+            </w:r>
+            <w:proofErr w:type="spellStart"/>
+            <w:r>
+              <w:rPr>
+                <w:rFonts w:ascii="Calibri" w:hAnsi="Calibri" w:cs="Calibri"/>
+                <w:color w:val="000000"/>
+                <w:sz w:val="22"/>
+                <w:szCs w:val="22"/>
+              </w:rPr>
+              <w:t>cessionario</w:t>
+            </w:r>
+            <w:proofErr w:type="gramEnd"/>
+            <w:r>
+              <w:rPr>
+                <w:rFonts w:ascii="Calibri" w:hAnsi="Calibri" w:cs="Calibri"/>
+                <w:color w:val="000000"/>
+                <w:sz w:val="22"/>
+                <w:szCs w:val="22"/>
+              </w:rPr>
+              <w:t>_cargo</w:t>
+            </w:r>
+            <w:proofErr w:type="spellEnd"/>
+            <w:r>
+              <w:rPr>
+                <w:rFonts w:ascii="Calibri" w:hAnsi="Calibri" w:cs="Calibri"/>
+                <w:color w:val="000000"/>
+                <w:sz w:val="22"/>
+                <w:szCs w:val="22"/>
+              </w:rPr>
+              <w:t xml:space="preserve"> }}</w:t>
+            </w:r>
+          </w:p>
+        </w:tc>
+      </w:tr>
+      <w:tr>
+        <w:trPr>
+          <w:trHeight w:val="375"/>
+        </w:trPr>
+        <w:tc>
+          <w:tcPr>
+            <w:tcW w:w="2091" w:type="dxa"/>
+            <w:tcBorders>
+              <w:top w:val="nil"/>
+              <w:left w:val="single" w:sz="4" w:space="0" w:color="auto"/>
+              <w:bottom w:val="single" w:sz="4" w:space="0" w:color="auto"/>
+              <w:right w:val="nil"/>
+            </w:tcBorders>
+            <w:noWrap/>
+            <w:vAlign w:val="bottom"/>
+            <w:hideMark/>
+          </w:tcPr>
+          <w:p>
+            <w:pPr>
+              <w:rPr>
+                <w:rFonts w:ascii="Calibri" w:hAnsi="Calibri" w:cs="Calibri"/>
+                <w:color w:val="000000"/>
+                <w:sz w:val="22"/>
+                <w:szCs w:val="22"/>
+              </w:rPr>
+            </w:pPr>
+            <w:r>
+              <w:rPr>
+                <w:rFonts w:ascii="Calibri" w:hAnsi="Calibri" w:cs="Calibri"/>
+                <w:color w:val="000000"/>
+                <w:sz w:val="22"/>
+                <w:szCs w:val="22"/>
+              </w:rPr>
+              <w:t>End.:</w:t>
+            </w:r>
+          </w:p>
+        </w:tc>
+        <w:tc>
+          <w:tcPr>
+            <w:tcW w:w="4037" w:type="dxa"/>
+            <w:tcBorders>
+              <w:top w:val="nil"/>
+              <w:left w:val="nil"/>
+              <w:bottom w:val="single" w:sz="4" w:space="0" w:color="auto"/>
+              <w:right w:val="nil"/>
+            </w:tcBorders>
+            <w:noWrap/>
+            <w:vAlign w:val="bottom"/>
+            <w:hideMark/>
+          </w:tcPr>
+          <w:p>
+            <w:pPr>
+              <w:rPr>
+                <w:rFonts w:ascii="Calibri" w:hAnsi="Calibri" w:cs="Calibri"/>
+                <w:color w:val="000000"/>
+                <w:sz w:val="22"/>
+                <w:szCs w:val="22"/>
+              </w:rPr>
+            </w:pPr>
+            <w:proofErr w:type="gramStart"/>
+            <w:r>
+              <w:rPr>
+                <w:rFonts w:ascii="Calibri" w:hAnsi="Calibri" w:cs="Calibri"/>
+                <w:color w:val="000000"/>
+                <w:sz w:val="22"/>
+                <w:szCs w:val="22"/>
+              </w:rPr>
+              <w:t xml:space="preserve">{{ </w:t>
+            </w:r>
+            <w:proofErr w:type="spellStart"/>
+            <w:r>
+              <w:rPr>
+                <w:rFonts w:ascii="Calibri" w:hAnsi="Calibri" w:cs="Calibri"/>
+                <w:color w:val="000000"/>
+                <w:sz w:val="22"/>
+                <w:szCs w:val="22"/>
+              </w:rPr>
+              <w:t>cessionario</w:t>
+            </w:r>
+            <w:proofErr w:type="gramEnd"/>
+            <w:r>
+              <w:rPr>
+                <w:rFonts w:ascii="Calibri" w:hAnsi="Calibri" w:cs="Calibri"/>
+                <w:color w:val="000000"/>
+                <w:sz w:val="22"/>
+                <w:szCs w:val="22"/>
+              </w:rPr>
+              <w:t>_endereco</w:t>
+            </w:r>
+            <w:proofErr w:type="spellEnd"/>
+            <w:r>
+              <w:rPr>
+                <w:rFonts w:ascii="Calibri" w:hAnsi="Calibri" w:cs="Calibri"/>
+                <w:color w:val="000000"/>
+                <w:sz w:val="22"/>
+                <w:szCs w:val="22"/>
+              </w:rPr>
+              <w:t xml:space="preserve"> }}</w:t>
+            </w:r>
+          </w:p>
+        </w:tc>
+        <w:tc>
+          <w:tcPr>
+            <w:tcW w:w="3408" w:type="dxa"/>
+            <w:tcBorders>
+              <w:top w:val="nil"/>
+              <w:left w:val="nil"/>
+              <w:bottom w:val="single" w:sz="4" w:space="0" w:color="auto"/>
+              <w:right w:val="single" w:sz="4" w:space="0" w:color="auto"/>
+            </w:tcBorders>
+            <w:noWrap/>
+            <w:vAlign w:val="bottom"/>
+            <w:hideMark/>
+          </w:tcPr>
+          <w:p>
+            <w:pPr>
+              <w:rPr>
+                <w:rFonts w:ascii="Calibri" w:hAnsi="Calibri" w:cs="Calibri"/>
+                <w:color w:val="000000"/>
+                <w:sz w:val="22"/>
+                <w:szCs w:val="22"/>
+              </w:rPr>
+            </w:pPr>
+            <w:r>
+              <w:rPr>
+                <w:rFonts w:ascii="Calibri" w:hAnsi="Calibri" w:cs="Calibri"/>
+                <w:color w:val="000000"/>
+                <w:sz w:val="22"/>
+                <w:szCs w:val="22"/>
+              </w:rPr>
+              <w:t> </w:t>
+            </w:r>
+          </w:p>
+        </w:tc>
+      </w:tr>
+    </w:tbl>
     <w:p>
       <w:pPr>
         <w:rPr>
@@ -3982,7 +6963,7 @@
     <w:p/>
     <w:tbl>
       <w:tblPr>
-        <w:tblW w:w="0" w:type="auto"/>
+        <w:tblW w:w="9527" w:type="dxa"/>
         <w:tblInd w:w="5" w:type="dxa"/>
         <w:tblBorders>
           <w:top w:val="single" w:sz="4" w:space="0" w:color="auto"/>
@@ -3994,19 +6975,21 @@
         <w:tblLook w:val="04A0" w:firstRow="1" w:lastRow="0" w:firstColumn="1" w:lastColumn="0" w:noHBand="0" w:noVBand="1"/>
       </w:tblPr>
       <w:tblGrid>
-        <w:gridCol w:w="982"/>
-        <w:gridCol w:w="142"/>
-        <w:gridCol w:w="3544"/>
-        <w:gridCol w:w="1002"/>
-        <w:gridCol w:w="283"/>
-        <w:gridCol w:w="3439"/>
+        <w:gridCol w:w="995"/>
+        <w:gridCol w:w="144"/>
+        <w:gridCol w:w="3595"/>
+        <w:gridCol w:w="1016"/>
+        <w:gridCol w:w="287"/>
+        <w:gridCol w:w="3490"/>
       </w:tblGrid>
       <w:tr>
+        <w:trPr>
+          <w:trHeight w:val="369"/>
+        </w:trPr>
         <w:tc>
           <w:tcPr>
-            <w:tcW w:w="9392" w:type="dxa"/>
+            <w:tcW w:w="9527" w:type="dxa"/>
             <w:gridSpan w:val="6"/>
-            <w:shd w:val="clear" w:color="auto" w:fill="auto"/>
             <w:vAlign w:val="center"/>
           </w:tcPr>
           <w:p>
@@ -4063,11 +7046,13 @@
         </w:tc>
       </w:tr>
       <w:tr>
+        <w:trPr>
+          <w:trHeight w:val="369"/>
+        </w:trPr>
         <w:tc>
           <w:tcPr>
-            <w:tcW w:w="4668" w:type="dxa"/>
+            <w:tcW w:w="4734" w:type="dxa"/>
             <w:gridSpan w:val="3"/>
-            <w:shd w:val="clear" w:color="auto" w:fill="auto"/>
             <w:vAlign w:val="center"/>
           </w:tcPr>
           <w:p>
@@ -4112,9 +7097,8 @@
         </w:tc>
         <w:tc>
           <w:tcPr>
-            <w:tcW w:w="4724" w:type="dxa"/>
+            <w:tcW w:w="4792" w:type="dxa"/>
             <w:gridSpan w:val="3"/>
-            <w:shd w:val="clear" w:color="auto" w:fill="auto"/>
             <w:vAlign w:val="center"/>
           </w:tcPr>
           <w:p>
@@ -4178,13 +7162,12 @@
       </w:tr>
       <w:tr>
         <w:trPr>
-          <w:trHeight w:val="340"/>
+          <w:trHeight w:val="369"/>
         </w:trPr>
         <w:tc>
           <w:tcPr>
-            <w:tcW w:w="1124" w:type="dxa"/>
+            <w:tcW w:w="1139" w:type="dxa"/>
             <w:gridSpan w:val="2"/>
-            <w:shd w:val="clear" w:color="auto" w:fill="auto"/>
             <w:vAlign w:val="center"/>
           </w:tcPr>
           <w:p>
@@ -4229,8 +7212,7 @@
         </w:tc>
         <w:tc>
           <w:tcPr>
-            <w:tcW w:w="3544" w:type="dxa"/>
-            <w:shd w:val="clear" w:color="auto" w:fill="auto"/>
+            <w:tcW w:w="3595" w:type="dxa"/>
             <w:vAlign w:val="center"/>
           </w:tcPr>
           <w:p>
@@ -4244,7 +7226,7 @@
                 <w:lang w:val="pt-BR"/>
               </w:rPr>
             </w:pPr>
-            <w:bookmarkStart w:id="14" w:name="Nome_Test1"/>
+            <w:proofErr w:type="gramStart"/>
             <w:r>
               <w:rPr>
                 <w:rFonts w:asciiTheme="minorHAnsi" w:hAnsiTheme="minorHAnsi" w:cstheme="minorHAnsi"/>
@@ -4252,16 +7234,24 @@
                 <w:szCs w:val="22"/>
                 <w:lang w:val="pt-BR"/>
               </w:rPr>
-              <w:t>[•]</w:t>
-            </w:r>
-            <w:bookmarkEnd w:id="14"/>
+              <w:t>{{ testemunha</w:t>
+            </w:r>
+            <w:proofErr w:type="gramEnd"/>
+            <w:r>
+              <w:rPr>
+                <w:rFonts w:asciiTheme="minorHAnsi" w:hAnsiTheme="minorHAnsi" w:cstheme="minorHAnsi"/>
+                <w:sz w:val="22"/>
+                <w:szCs w:val="22"/>
+                <w:lang w:val="pt-BR"/>
+              </w:rPr>
+              <w:t>1_nome }}</w:t>
+            </w:r>
           </w:p>
         </w:tc>
         <w:tc>
           <w:tcPr>
-            <w:tcW w:w="1285" w:type="dxa"/>
+            <w:tcW w:w="1303" w:type="dxa"/>
             <w:gridSpan w:val="2"/>
-            <w:shd w:val="clear" w:color="auto" w:fill="auto"/>
             <w:vAlign w:val="center"/>
           </w:tcPr>
           <w:p>
@@ -4297,8 +7287,7 @@
         </w:tc>
         <w:tc>
           <w:tcPr>
-            <w:tcW w:w="3439" w:type="dxa"/>
-            <w:shd w:val="clear" w:color="auto" w:fill="auto"/>
+            <w:tcW w:w="3488" w:type="dxa"/>
             <w:vAlign w:val="center"/>
           </w:tcPr>
           <w:p>
@@ -4312,7 +7301,7 @@
                 <w:lang w:val="pt-BR"/>
               </w:rPr>
             </w:pPr>
-            <w:bookmarkStart w:id="15" w:name="Nome_Test2"/>
+            <w:proofErr w:type="gramStart"/>
             <w:r>
               <w:rPr>
                 <w:rFonts w:asciiTheme="minorHAnsi" w:hAnsiTheme="minorHAnsi" w:cstheme="minorHAnsi"/>
@@ -4320,20 +7309,28 @@
                 <w:szCs w:val="22"/>
                 <w:lang w:val="pt-BR"/>
               </w:rPr>
-              <w:t>[•]</w:t>
-            </w:r>
-            <w:bookmarkEnd w:id="15"/>
+              <w:t>{{ testemunha</w:t>
+            </w:r>
+            <w:proofErr w:type="gramEnd"/>
+            <w:r>
+              <w:rPr>
+                <w:rFonts w:asciiTheme="minorHAnsi" w:hAnsiTheme="minorHAnsi" w:cstheme="minorHAnsi"/>
+                <w:sz w:val="22"/>
+                <w:szCs w:val="22"/>
+                <w:lang w:val="pt-BR"/>
+              </w:rPr>
+              <w:t>2_nome }}</w:t>
+            </w:r>
           </w:p>
         </w:tc>
       </w:tr>
       <w:tr>
         <w:trPr>
-          <w:trHeight w:val="340"/>
+          <w:trHeight w:val="369"/>
         </w:trPr>
         <w:tc>
           <w:tcPr>
-            <w:tcW w:w="982" w:type="dxa"/>
-            <w:shd w:val="clear" w:color="auto" w:fill="auto"/>
+            <w:tcW w:w="995" w:type="dxa"/>
             <w:vAlign w:val="center"/>
           </w:tcPr>
           <w:p>
@@ -4369,9 +7366,8 @@
         </w:tc>
         <w:tc>
           <w:tcPr>
-            <w:tcW w:w="3686" w:type="dxa"/>
+            <w:tcW w:w="3739" w:type="dxa"/>
             <w:gridSpan w:val="2"/>
-            <w:shd w:val="clear" w:color="auto" w:fill="auto"/>
             <w:vAlign w:val="center"/>
           </w:tcPr>
           <w:p>
@@ -4385,7 +7381,7 @@
                 <w:lang w:val="pt-BR"/>
               </w:rPr>
             </w:pPr>
-            <w:bookmarkStart w:id="16" w:name="CPF_Test1"/>
+            <w:proofErr w:type="gramStart"/>
             <w:r>
               <w:rPr>
                 <w:rFonts w:asciiTheme="minorHAnsi" w:hAnsiTheme="minorHAnsi" w:cstheme="minorHAnsi"/>
@@ -4393,15 +7389,23 @@
                 <w:szCs w:val="22"/>
                 <w:lang w:val="pt-BR"/>
               </w:rPr>
-              <w:t>[•]</w:t>
-            </w:r>
-            <w:bookmarkEnd w:id="16"/>
+              <w:t>{{ testemunha</w:t>
+            </w:r>
+            <w:proofErr w:type="gramEnd"/>
+            <w:r>
+              <w:rPr>
+                <w:rFonts w:asciiTheme="minorHAnsi" w:hAnsiTheme="minorHAnsi" w:cstheme="minorHAnsi"/>
+                <w:sz w:val="22"/>
+                <w:szCs w:val="22"/>
+                <w:lang w:val="pt-BR"/>
+              </w:rPr>
+              <w:t>1_cpf }}</w:t>
+            </w:r>
           </w:p>
         </w:tc>
         <w:tc>
           <w:tcPr>
-            <w:tcW w:w="1002" w:type="dxa"/>
-            <w:shd w:val="clear" w:color="auto" w:fill="auto"/>
+            <w:tcW w:w="1016" w:type="dxa"/>
             <w:vAlign w:val="center"/>
           </w:tcPr>
           <w:p>
@@ -4428,9 +7432,8 @@
         </w:tc>
         <w:tc>
           <w:tcPr>
-            <w:tcW w:w="3722" w:type="dxa"/>
+            <w:tcW w:w="3775" w:type="dxa"/>
             <w:gridSpan w:val="2"/>
-            <w:shd w:val="clear" w:color="auto" w:fill="auto"/>
             <w:vAlign w:val="center"/>
           </w:tcPr>
           <w:p>
@@ -4444,7 +7447,7 @@
                 <w:lang w:val="pt-BR"/>
               </w:rPr>
             </w:pPr>
-            <w:bookmarkStart w:id="17" w:name="CPF_Test2"/>
+            <w:proofErr w:type="gramStart"/>
             <w:r>
               <w:rPr>
                 <w:rFonts w:asciiTheme="minorHAnsi" w:hAnsiTheme="minorHAnsi" w:cstheme="minorHAnsi"/>
@@ -4452,9 +7455,18 @@
                 <w:szCs w:val="22"/>
                 <w:lang w:val="pt-BR"/>
               </w:rPr>
-              <w:t>[•]</w:t>
-            </w:r>
-            <w:bookmarkEnd w:id="17"/>
+              <w:t>{{ testemunha</w:t>
+            </w:r>
+            <w:proofErr w:type="gramEnd"/>
+            <w:r>
+              <w:rPr>
+                <w:rFonts w:asciiTheme="minorHAnsi" w:hAnsiTheme="minorHAnsi" w:cstheme="minorHAnsi"/>
+                <w:sz w:val="22"/>
+                <w:szCs w:val="22"/>
+                <w:lang w:val="pt-BR"/>
+              </w:rPr>
+              <w:t>2_cpf }}</w:t>
+            </w:r>
           </w:p>
         </w:tc>
       </w:tr>
@@ -4493,7 +7505,7 @@
 </file>
 
 <file path=word/endnotes.xml><?xml version="1.0" encoding="utf-8"?>
-<w:endnotes xmlns:wpc="http://schemas.microsoft.com/office/word/2010/wordprocessingCanvas" xmlns:cx="http://schemas.microsoft.com/office/drawing/2014/chartex" xmlns:cx1="http://schemas.microsoft.com/office/drawing/2015/9/8/chartex" xmlns:cx2="http://schemas.microsoft.com/office/drawing/2015/10/21/chartex" xmlns:cx3="http://schemas.microsoft.com/office/drawing/2016/5/9/chartex" xmlns:cx4="http://schemas.microsoft.com/office/drawing/2016/5/10/chartex" xmlns:cx5="http://schemas.microsoft.com/office/drawing/2016/5/11/chartex" xmlns:cx6="http://schemas.microsoft.com/office/drawing/2016/5/12/chartex" xmlns:cx7="http://schemas.microsoft.com/office/drawing/2016/5/13/chartex" xmlns:cx8="http://schemas.microsoft.com/office/drawing/2016/5/14/chartex" xmlns:mc="http://schemas.openxmlformats.org/markup-compatibility/2006" xmlns:aink="http://schemas.microsoft.com/office/drawing/2016/ink" xmlns:am3d="http://schemas.microsoft.com/office/drawing/2017/model3d" xmlns:o="urn:schemas-microsoft-com:office:office" xmlns:r="http://schemas.openxmlformats.org/officeDocument/2006/relationships" xmlns:m="http://schemas.openxmlformats.org/officeDocument/2006/math" xmlns:v="urn:schemas-microsoft-com:vml" xmlns:wp14="http://schemas.microsoft.com/office/word/2010/wordprocessingDrawing" xmlns:wp="http://schemas.openxmlformats.org/drawingml/2006/wordprocessingDrawing" xmlns:w10="urn:schemas-microsoft-com:office:word" xmlns:w="http://schemas.openxmlformats.org/wordprocessingml/2006/main" xmlns:w14="http://schemas.microsoft.com/office/word/2010/wordml" xmlns:w15="http://schemas.microsoft.com/office/word/2012/wordml" xmlns:w16cex="http://schemas.microsoft.com/office/word/2018/wordml/cex" xmlns:w16cid="http://schemas.microsoft.com/office/word/2016/wordml/cid" xmlns:w16="http://schemas.microsoft.com/office/word/2018/wordml" xmlns:w16sdtdh="http://schemas.microsoft.com/office/word/2020/wordml/sdtdatahash" xmlns:w16se="http://schemas.microsoft.com/office/word/2015/wordml/symex" xmlns:wpg="http://schemas.microsoft.com/office/word/2010/wordprocessingGroup" xmlns:wpi="http://schemas.microsoft.com/office/word/2010/wordprocessingInk" xmlns:wne="http://schemas.microsoft.com/office/word/2006/wordml" xmlns:wps="http://schemas.microsoft.com/office/word/2010/wordprocessingShape" mc:Ignorable="w14 w15 w16se w16cid w16 w16cex w16sdtdh wp14">
+<w:endnotes xmlns:wpc="http://schemas.microsoft.com/office/word/2010/wordprocessingCanvas" xmlns:cx="http://schemas.microsoft.com/office/drawing/2014/chartex" xmlns:cx1="http://schemas.microsoft.com/office/drawing/2015/9/8/chartex" xmlns:cx2="http://schemas.microsoft.com/office/drawing/2015/10/21/chartex" xmlns:cx3="http://schemas.microsoft.com/office/drawing/2016/5/9/chartex" xmlns:cx4="http://schemas.microsoft.com/office/drawing/2016/5/10/chartex" xmlns:cx5="http://schemas.microsoft.com/office/drawing/2016/5/11/chartex" xmlns:cx6="http://schemas.microsoft.com/office/drawing/2016/5/12/chartex" xmlns:cx7="http://schemas.microsoft.com/office/drawing/2016/5/13/chartex" xmlns:cx8="http://schemas.microsoft.com/office/drawing/2016/5/14/chartex" xmlns:mc="http://schemas.openxmlformats.org/markup-compatibility/2006" xmlns:aink="http://schemas.microsoft.com/office/drawing/2016/ink" xmlns:am3d="http://schemas.microsoft.com/office/drawing/2017/model3d" xmlns:o="urn:schemas-microsoft-com:office:office" xmlns:oel="http://schemas.microsoft.com/office/2019/extlst" xmlns:r="http://schemas.openxmlformats.org/officeDocument/2006/relationships" xmlns:m="http://schemas.openxmlformats.org/officeDocument/2006/math" xmlns:v="urn:schemas-microsoft-com:vml" xmlns:wp14="http://schemas.microsoft.com/office/word/2010/wordprocessingDrawing" xmlns:wp="http://schemas.openxmlformats.org/drawingml/2006/wordprocessingDrawing" xmlns:w10="urn:schemas-microsoft-com:office:word" xmlns:w="http://schemas.openxmlformats.org/wordprocessingml/2006/main" xmlns:w14="http://schemas.microsoft.com/office/word/2010/wordml" xmlns:w15="http://schemas.microsoft.com/office/word/2012/wordml" xmlns:w16cex="http://schemas.microsoft.com/office/word/2018/wordml/cex" xmlns:w16cid="http://schemas.microsoft.com/office/word/2016/wordml/cid" xmlns:w16="http://schemas.microsoft.com/office/word/2018/wordml" xmlns:w16du="http://schemas.microsoft.com/office/word/2023/wordml/word16du" xmlns:w16sdtdh="http://schemas.microsoft.com/office/word/2020/wordml/sdtdatahash" xmlns:w16sdtfl="http://schemas.microsoft.com/office/word/2024/wordml/sdtformatlock" xmlns:w16se="http://schemas.microsoft.com/office/word/2015/wordml/symex" xmlns:wpg="http://schemas.microsoft.com/office/word/2010/wordprocessingGroup" xmlns:wpi="http://schemas.microsoft.com/office/word/2010/wordprocessingInk" xmlns:wne="http://schemas.microsoft.com/office/word/2006/wordml" xmlns:wps="http://schemas.microsoft.com/office/word/2010/wordprocessingShape" mc:Ignorable="w14 w15 w16se w16cid w16 w16cex w16sdtdh w16sdtfl w16du wp14">
   <w:endnote w:type="separator" w:id="-1">
     <w:p>
       <w:r>
@@ -4512,7 +7524,7 @@
 </file>
 
 <file path=word/footer1.xml><?xml version="1.0" encoding="utf-8"?>
-<w:ftr xmlns:wpc="http://schemas.microsoft.com/office/word/2010/wordprocessingCanvas" xmlns:cx="http://schemas.microsoft.com/office/drawing/2014/chartex" xmlns:cx1="http://schemas.microsoft.com/office/drawing/2015/9/8/chartex" xmlns:cx2="http://schemas.microsoft.com/office/drawing/2015/10/21/chartex" xmlns:cx3="http://schemas.microsoft.com/office/drawing/2016/5/9/chartex" xmlns:cx4="http://schemas.microsoft.com/office/drawing/2016/5/10/chartex" xmlns:cx5="http://schemas.microsoft.com/office/drawing/2016/5/11/chartex" xmlns:cx6="http://schemas.microsoft.com/office/drawing/2016/5/12/chartex" xmlns:cx7="http://schemas.microsoft.com/office/drawing/2016/5/13/chartex" xmlns:cx8="http://schemas.microsoft.com/office/drawing/2016/5/14/chartex" xmlns:mc="http://schemas.openxmlformats.org/markup-compatibility/2006" xmlns:aink="http://schemas.microsoft.com/office/drawing/2016/ink" xmlns:am3d="http://schemas.microsoft.com/office/drawing/2017/model3d" xmlns:o="urn:schemas-microsoft-com:office:office" xmlns:r="http://schemas.openxmlformats.org/officeDocument/2006/relationships" xmlns:m="http://schemas.openxmlformats.org/officeDocument/2006/math" xmlns:v="urn:schemas-microsoft-com:vml" xmlns:wp14="http://schemas.microsoft.com/office/word/2010/wordprocessingDrawing" xmlns:wp="http://schemas.openxmlformats.org/drawingml/2006/wordprocessingDrawing" xmlns:w10="urn:schemas-microsoft-com:office:word" xmlns:w="http://schemas.openxmlformats.org/wordprocessingml/2006/main" xmlns:w14="http://schemas.microsoft.com/office/word/2010/wordml" xmlns:w15="http://schemas.microsoft.com/office/word/2012/wordml" xmlns:w16cex="http://schemas.microsoft.com/office/word/2018/wordml/cex" xmlns:w16cid="http://schemas.microsoft.com/office/word/2016/wordml/cid" xmlns:w16="http://schemas.microsoft.com/office/word/2018/wordml" xmlns:w16sdtdh="http://schemas.microsoft.com/office/word/2020/wordml/sdtdatahash" xmlns:w16se="http://schemas.microsoft.com/office/word/2015/wordml/symex" xmlns:wpg="http://schemas.microsoft.com/office/word/2010/wordprocessingGroup" xmlns:wpi="http://schemas.microsoft.com/office/word/2010/wordprocessingInk" xmlns:wne="http://schemas.microsoft.com/office/word/2006/wordml" xmlns:wps="http://schemas.microsoft.com/office/word/2010/wordprocessingShape" mc:Ignorable="w14 w15 w16se w16cid w16 w16cex w16sdtdh wp14">
+<w:ftr xmlns:wpc="http://schemas.microsoft.com/office/word/2010/wordprocessingCanvas" xmlns:cx="http://schemas.microsoft.com/office/drawing/2014/chartex" xmlns:cx1="http://schemas.microsoft.com/office/drawing/2015/9/8/chartex" xmlns:cx2="http://schemas.microsoft.com/office/drawing/2015/10/21/chartex" xmlns:cx3="http://schemas.microsoft.com/office/drawing/2016/5/9/chartex" xmlns:cx4="http://schemas.microsoft.com/office/drawing/2016/5/10/chartex" xmlns:cx5="http://schemas.microsoft.com/office/drawing/2016/5/11/chartex" xmlns:cx6="http://schemas.microsoft.com/office/drawing/2016/5/12/chartex" xmlns:cx7="http://schemas.microsoft.com/office/drawing/2016/5/13/chartex" xmlns:cx8="http://schemas.microsoft.com/office/drawing/2016/5/14/chartex" xmlns:mc="http://schemas.openxmlformats.org/markup-compatibility/2006" xmlns:aink="http://schemas.microsoft.com/office/drawing/2016/ink" xmlns:am3d="http://schemas.microsoft.com/office/drawing/2017/model3d" xmlns:o="urn:schemas-microsoft-com:office:office" xmlns:oel="http://schemas.microsoft.com/office/2019/extlst" xmlns:r="http://schemas.openxmlformats.org/officeDocument/2006/relationships" xmlns:m="http://schemas.openxmlformats.org/officeDocument/2006/math" xmlns:v="urn:schemas-microsoft-com:vml" xmlns:wp14="http://schemas.microsoft.com/office/word/2010/wordprocessingDrawing" xmlns:wp="http://schemas.openxmlformats.org/drawingml/2006/wordprocessingDrawing" xmlns:w10="urn:schemas-microsoft-com:office:word" xmlns:w="http://schemas.openxmlformats.org/wordprocessingml/2006/main" xmlns:w14="http://schemas.microsoft.com/office/word/2010/wordml" xmlns:w15="http://schemas.microsoft.com/office/word/2012/wordml" xmlns:w16cex="http://schemas.microsoft.com/office/word/2018/wordml/cex" xmlns:w16cid="http://schemas.microsoft.com/office/word/2016/wordml/cid" xmlns:w16="http://schemas.microsoft.com/office/word/2018/wordml" xmlns:w16du="http://schemas.microsoft.com/office/word/2023/wordml/word16du" xmlns:w16sdtdh="http://schemas.microsoft.com/office/word/2020/wordml/sdtdatahash" xmlns:w16sdtfl="http://schemas.microsoft.com/office/word/2024/wordml/sdtformatlock" xmlns:w16se="http://schemas.microsoft.com/office/word/2015/wordml/symex" xmlns:wpg="http://schemas.microsoft.com/office/word/2010/wordprocessingGroup" xmlns:wpi="http://schemas.microsoft.com/office/word/2010/wordprocessingInk" xmlns:wne="http://schemas.microsoft.com/office/word/2006/wordml" xmlns:wps="http://schemas.microsoft.com/office/word/2010/wordprocessingShape" mc:Ignorable="w14 w15 w16se w16cid w16 w16cex w16sdtdh w16sdtfl w16du wp14">
   <w:tbl>
     <w:tblPr>
       <w:tblStyle w:val="Tabelacomgrade"/>
@@ -4786,7 +7798,7 @@
 </file>
 
 <file path=word/footnotes.xml><?xml version="1.0" encoding="utf-8"?>
-<w:footnotes xmlns:wpc="http://schemas.microsoft.com/office/word/2010/wordprocessingCanvas" xmlns:cx="http://schemas.microsoft.com/office/drawing/2014/chartex" xmlns:cx1="http://schemas.microsoft.com/office/drawing/2015/9/8/chartex" xmlns:cx2="http://schemas.microsoft.com/office/drawing/2015/10/21/chartex" xmlns:cx3="http://schemas.microsoft.com/office/drawing/2016/5/9/chartex" xmlns:cx4="http://schemas.microsoft.com/office/drawing/2016/5/10/chartex" xmlns:cx5="http://schemas.microsoft.com/office/drawing/2016/5/11/chartex" xmlns:cx6="http://schemas.microsoft.com/office/drawing/2016/5/12/chartex" xmlns:cx7="http://schemas.microsoft.com/office/drawing/2016/5/13/chartex" xmlns:cx8="http://schemas.microsoft.com/office/drawing/2016/5/14/chartex" xmlns:mc="http://schemas.openxmlformats.org/markup-compatibility/2006" xmlns:aink="http://schemas.microsoft.com/office/drawing/2016/ink" xmlns:am3d="http://schemas.microsoft.com/office/drawing/2017/model3d" xmlns:o="urn:schemas-microsoft-com:office:office" xmlns:r="http://schemas.openxmlformats.org/officeDocument/2006/relationships" xmlns:m="http://schemas.openxmlformats.org/officeDocument/2006/math" xmlns:v="urn:schemas-microsoft-com:vml" xmlns:wp14="http://schemas.microsoft.com/office/word/2010/wordprocessingDrawing" xmlns:wp="http://schemas.openxmlformats.org/drawingml/2006/wordprocessingDrawing" xmlns:w10="urn:schemas-microsoft-com:office:word" xmlns:w="http://schemas.openxmlformats.org/wordprocessingml/2006/main" xmlns:w14="http://schemas.microsoft.com/office/word/2010/wordml" xmlns:w15="http://schemas.microsoft.com/office/word/2012/wordml" xmlns:w16cex="http://schemas.microsoft.com/office/word/2018/wordml/cex" xmlns:w16cid="http://schemas.microsoft.com/office/word/2016/wordml/cid" xmlns:w16="http://schemas.microsoft.com/office/word/2018/wordml" xmlns:w16sdtdh="http://schemas.microsoft.com/office/word/2020/wordml/sdtdatahash" xmlns:w16se="http://schemas.microsoft.com/office/word/2015/wordml/symex" xmlns:wpg="http://schemas.microsoft.com/office/word/2010/wordprocessingGroup" xmlns:wpi="http://schemas.microsoft.com/office/word/2010/wordprocessingInk" xmlns:wne="http://schemas.microsoft.com/office/word/2006/wordml" xmlns:wps="http://schemas.microsoft.com/office/word/2010/wordprocessingShape" mc:Ignorable="w14 w15 w16se w16cid w16 w16cex w16sdtdh wp14">
+<w:footnotes xmlns:wpc="http://schemas.microsoft.com/office/word/2010/wordprocessingCanvas" xmlns:cx="http://schemas.microsoft.com/office/drawing/2014/chartex" xmlns:cx1="http://schemas.microsoft.com/office/drawing/2015/9/8/chartex" xmlns:cx2="http://schemas.microsoft.com/office/drawing/2015/10/21/chartex" xmlns:cx3="http://schemas.microsoft.com/office/drawing/2016/5/9/chartex" xmlns:cx4="http://schemas.microsoft.com/office/drawing/2016/5/10/chartex" xmlns:cx5="http://schemas.microsoft.com/office/drawing/2016/5/11/chartex" xmlns:cx6="http://schemas.microsoft.com/office/drawing/2016/5/12/chartex" xmlns:cx7="http://schemas.microsoft.com/office/drawing/2016/5/13/chartex" xmlns:cx8="http://schemas.microsoft.com/office/drawing/2016/5/14/chartex" xmlns:mc="http://schemas.openxmlformats.org/markup-compatibility/2006" xmlns:aink="http://schemas.microsoft.com/office/drawing/2016/ink" xmlns:am3d="http://schemas.microsoft.com/office/drawing/2017/model3d" xmlns:o="urn:schemas-microsoft-com:office:office" xmlns:oel="http://schemas.microsoft.com/office/2019/extlst" xmlns:r="http://schemas.openxmlformats.org/officeDocument/2006/relationships" xmlns:m="http://schemas.openxmlformats.org/officeDocument/2006/math" xmlns:v="urn:schemas-microsoft-com:vml" xmlns:wp14="http://schemas.microsoft.com/office/word/2010/wordprocessingDrawing" xmlns:wp="http://schemas.openxmlformats.org/drawingml/2006/wordprocessingDrawing" xmlns:w10="urn:schemas-microsoft-com:office:word" xmlns:w="http://schemas.openxmlformats.org/wordprocessingml/2006/main" xmlns:w14="http://schemas.microsoft.com/office/word/2010/wordml" xmlns:w15="http://schemas.microsoft.com/office/word/2012/wordml" xmlns:w16cex="http://schemas.microsoft.com/office/word/2018/wordml/cex" xmlns:w16cid="http://schemas.microsoft.com/office/word/2016/wordml/cid" xmlns:w16="http://schemas.microsoft.com/office/word/2018/wordml" xmlns:w16du="http://schemas.microsoft.com/office/word/2023/wordml/word16du" xmlns:w16sdtdh="http://schemas.microsoft.com/office/word/2020/wordml/sdtdatahash" xmlns:w16sdtfl="http://schemas.microsoft.com/office/word/2024/wordml/sdtformatlock" xmlns:w16se="http://schemas.microsoft.com/office/word/2015/wordml/symex" xmlns:wpg="http://schemas.microsoft.com/office/word/2010/wordprocessingGroup" xmlns:wpi="http://schemas.microsoft.com/office/word/2010/wordprocessingInk" xmlns:wne="http://schemas.microsoft.com/office/word/2006/wordml" xmlns:wps="http://schemas.microsoft.com/office/word/2010/wordprocessingShape" mc:Ignorable="w14 w15 w16se w16cid w16 w16cex w16sdtdh w16sdtfl w16du wp14">
   <w:footnote w:type="separator" w:id="-1">
     <w:p>
       <w:r>
@@ -4805,7 +7817,7 @@
 </file>
 
 <file path=word/numbering.xml><?xml version="1.0" encoding="utf-8"?>
-<w:numbering xmlns:wpc="http://schemas.microsoft.com/office/word/2010/wordprocessingCanvas" xmlns:cx="http://schemas.microsoft.com/office/drawing/2014/chartex" xmlns:cx1="http://schemas.microsoft.com/office/drawing/2015/9/8/chartex" xmlns:cx2="http://schemas.microsoft.com/office/drawing/2015/10/21/chartex" xmlns:cx3="http://schemas.microsoft.com/office/drawing/2016/5/9/chartex" xmlns:cx4="http://schemas.microsoft.com/office/drawing/2016/5/10/chartex" xmlns:cx5="http://schemas.microsoft.com/office/drawing/2016/5/11/chartex" xmlns:cx6="http://schemas.microsoft.com/office/drawing/2016/5/12/chartex" xmlns:cx7="http://schemas.microsoft.com/office/drawing/2016/5/13/chartex" xmlns:cx8="http://schemas.microsoft.com/office/drawing/2016/5/14/chartex" xmlns:mc="http://schemas.openxmlformats.org/markup-compatibility/2006" xmlns:aink="http://schemas.microsoft.com/office/drawing/2016/ink" xmlns:am3d="http://schemas.microsoft.com/office/drawing/2017/model3d" xmlns:o="urn:schemas-microsoft-com:office:office" xmlns:r="http://schemas.openxmlformats.org/officeDocument/2006/relationships" xmlns:m="http://schemas.openxmlformats.org/officeDocument/2006/math" xmlns:v="urn:schemas-microsoft-com:vml" xmlns:wp14="http://schemas.microsoft.com/office/word/2010/wordprocessingDrawing" xmlns:wp="http://schemas.openxmlformats.org/drawingml/2006/wordprocessingDrawing" xmlns:w10="urn:schemas-microsoft-com:office:word" xmlns:w="http://schemas.openxmlformats.org/wordprocessingml/2006/main" xmlns:w14="http://schemas.microsoft.com/office/word/2010/wordml" xmlns:w15="http://schemas.microsoft.com/office/word/2012/wordml" xmlns:w16cex="http://schemas.microsoft.com/office/word/2018/wordml/cex" xmlns:w16cid="http://schemas.microsoft.com/office/word/2016/wordml/cid" xmlns:w16="http://schemas.microsoft.com/office/word/2018/wordml" xmlns:w16sdtdh="http://schemas.microsoft.com/office/word/2020/wordml/sdtdatahash" xmlns:w16se="http://schemas.microsoft.com/office/word/2015/wordml/symex" xmlns:wpg="http://schemas.microsoft.com/office/word/2010/wordprocessingGroup" xmlns:wpi="http://schemas.microsoft.com/office/word/2010/wordprocessingInk" xmlns:wne="http://schemas.microsoft.com/office/word/2006/wordml" xmlns:wps="http://schemas.microsoft.com/office/word/2010/wordprocessingShape" mc:Ignorable="w14 w15 w16se w16cid w16 w16cex w16sdtdh wp14">
+<w:numbering xmlns:wpc="http://schemas.microsoft.com/office/word/2010/wordprocessingCanvas" xmlns:cx="http://schemas.microsoft.com/office/drawing/2014/chartex" xmlns:cx1="http://schemas.microsoft.com/office/drawing/2015/9/8/chartex" xmlns:cx2="http://schemas.microsoft.com/office/drawing/2015/10/21/chartex" xmlns:cx3="http://schemas.microsoft.com/office/drawing/2016/5/9/chartex" xmlns:cx4="http://schemas.microsoft.com/office/drawing/2016/5/10/chartex" xmlns:cx5="http://schemas.microsoft.com/office/drawing/2016/5/11/chartex" xmlns:cx6="http://schemas.microsoft.com/office/drawing/2016/5/12/chartex" xmlns:cx7="http://schemas.microsoft.com/office/drawing/2016/5/13/chartex" xmlns:cx8="http://schemas.microsoft.com/office/drawing/2016/5/14/chartex" xmlns:mc="http://schemas.openxmlformats.org/markup-compatibility/2006" xmlns:aink="http://schemas.microsoft.com/office/drawing/2016/ink" xmlns:am3d="http://schemas.microsoft.com/office/drawing/2017/model3d" xmlns:o="urn:schemas-microsoft-com:office:office" xmlns:oel="http://schemas.microsoft.com/office/2019/extlst" xmlns:r="http://schemas.openxmlformats.org/officeDocument/2006/relationships" xmlns:m="http://schemas.openxmlformats.org/officeDocument/2006/math" xmlns:v="urn:schemas-microsoft-com:vml" xmlns:wp14="http://schemas.microsoft.com/office/word/2010/wordprocessingDrawing" xmlns:wp="http://schemas.openxmlformats.org/drawingml/2006/wordprocessingDrawing" xmlns:w10="urn:schemas-microsoft-com:office:word" xmlns:w="http://schemas.openxmlformats.org/wordprocessingml/2006/main" xmlns:w14="http://schemas.microsoft.com/office/word/2010/wordml" xmlns:w15="http://schemas.microsoft.com/office/word/2012/wordml" xmlns:w16cex="http://schemas.microsoft.com/office/word/2018/wordml/cex" xmlns:w16cid="http://schemas.microsoft.com/office/word/2016/wordml/cid" xmlns:w16="http://schemas.microsoft.com/office/word/2018/wordml" xmlns:w16du="http://schemas.microsoft.com/office/word/2023/wordml/word16du" xmlns:w16sdtdh="http://schemas.microsoft.com/office/word/2020/wordml/sdtdatahash" xmlns:w16sdtfl="http://schemas.microsoft.com/office/word/2024/wordml/sdtformatlock" xmlns:w16se="http://schemas.microsoft.com/office/word/2015/wordml/symex" xmlns:wpg="http://schemas.microsoft.com/office/word/2010/wordprocessingGroup" xmlns:wpi="http://schemas.microsoft.com/office/word/2010/wordprocessingInk" xmlns:wne="http://schemas.microsoft.com/office/word/2006/wordml" xmlns:wps="http://schemas.microsoft.com/office/word/2010/wordprocessingShape" mc:Ignorable="w14 w15 w16se w16cid w16 w16cex w16sdtdh w16sdtfl w16du wp14">
   <w:abstractNum w:abstractNumId="0" w15:restartNumberingAfterBreak="0">
     <w:nsid w:val="00000005"/>
     <w:multiLevelType w:val="multilevel"/>
@@ -5444,19 +8456,19 @@
       </w:pPr>
     </w:lvl>
   </w:abstractNum>
-  <w:num w:numId="1">
+  <w:num w:numId="1" w16cid:durableId="548342753">
     <w:abstractNumId w:val="1"/>
   </w:num>
-  <w:num w:numId="2">
+  <w:num w:numId="2" w16cid:durableId="1933588739">
     <w:abstractNumId w:val="2"/>
   </w:num>
-  <w:num w:numId="3">
+  <w:num w:numId="3" w16cid:durableId="298849578">
     <w:abstractNumId w:val="5"/>
   </w:num>
-  <w:num w:numId="4">
+  <w:num w:numId="4" w16cid:durableId="1247198">
     <w:abstractNumId w:val="3"/>
   </w:num>
-  <w:num w:numId="5">
+  <w:num w:numId="5" w16cid:durableId="1253929790">
     <w:abstractNumId w:val="4"/>
   </w:num>
   <w:numIdMacAtCleanup w:val="5"/>
@@ -5464,7 +8476,7 @@
 </file>
 
 <file path=word/styles.xml><?xml version="1.0" encoding="utf-8"?>
-<w:styles xmlns:mc="http://schemas.openxmlformats.org/markup-compatibility/2006" xmlns:r="http://schemas.openxmlformats.org/officeDocument/2006/relationships" xmlns:w="http://schemas.openxmlformats.org/wordprocessingml/2006/main" xmlns:w14="http://schemas.microsoft.com/office/word/2010/wordml" xmlns:w15="http://schemas.microsoft.com/office/word/2012/wordml" xmlns:w16cex="http://schemas.microsoft.com/office/word/2018/wordml/cex" xmlns:w16cid="http://schemas.microsoft.com/office/word/2016/wordml/cid" xmlns:w16="http://schemas.microsoft.com/office/word/2018/wordml" xmlns:w16sdtdh="http://schemas.microsoft.com/office/word/2020/wordml/sdtdatahash" xmlns:w16se="http://schemas.microsoft.com/office/word/2015/wordml/symex" mc:Ignorable="w14 w15 w16se w16cid w16 w16cex w16sdtdh">
+<w:styles xmlns:mc="http://schemas.openxmlformats.org/markup-compatibility/2006" xmlns:r="http://schemas.openxmlformats.org/officeDocument/2006/relationships" xmlns:w="http://schemas.openxmlformats.org/wordprocessingml/2006/main" xmlns:w14="http://schemas.microsoft.com/office/word/2010/wordml" xmlns:w15="http://schemas.microsoft.com/office/word/2012/wordml" xmlns:w16cex="http://schemas.microsoft.com/office/word/2018/wordml/cex" xmlns:w16cid="http://schemas.microsoft.com/office/word/2016/wordml/cid" xmlns:w16="http://schemas.microsoft.com/office/word/2018/wordml" xmlns:w16du="http://schemas.microsoft.com/office/word/2023/wordml/word16du" xmlns:w16sdtdh="http://schemas.microsoft.com/office/word/2020/wordml/sdtdatahash" xmlns:w16sdtfl="http://schemas.microsoft.com/office/word/2024/wordml/sdtformatlock" xmlns:w16se="http://schemas.microsoft.com/office/word/2015/wordml/symex" mc:Ignorable="w14 w15 w16se w16cid w16 w16cex w16sdtdh w16sdtfl w16du">
   <w:docDefaults>
     <w:rPrDefault>
       <w:rPr>

</xml_diff>